<commit_message>
CS662 Homework 7 Final
</commit_message>
<xml_diff>
--- a/BU/CS662/Rissman_Assignment_7.docx
+++ b/BU/CS662/Rissman_Assignment_7.docx
@@ -547,6 +547,46 @@
                   </m:r>
                 </m:sub>
               </m:sSub>
+              <m:r>
+                <w:rPr>
+                  <w:rFonts w:ascii="Cambria Math" w:eastAsiaTheme="minorEastAsia" w:hAnsi="Cambria Math"/>
+                  <w:sz w:val="24"/>
+                  <w:szCs w:val="24"/>
+                </w:rPr>
+                <m:t>,</m:t>
+              </m:r>
+              <m:sSub>
+                <m:sSubPr>
+                  <m:ctrlPr>
+                    <w:rPr>
+                      <w:rFonts w:ascii="Cambria Math" w:eastAsiaTheme="minorEastAsia" w:hAnsi="Cambria Math"/>
+                      <w:i/>
+                      <w:sz w:val="24"/>
+                      <w:szCs w:val="24"/>
+                    </w:rPr>
+                  </m:ctrlPr>
+                </m:sSubPr>
+                <m:e>
+                  <m:r>
+                    <w:rPr>
+                      <w:rFonts w:ascii="Cambria Math" w:eastAsiaTheme="minorEastAsia" w:hAnsi="Cambria Math"/>
+                      <w:sz w:val="24"/>
+                      <w:szCs w:val="24"/>
+                    </w:rPr>
+                    <m:t>q</m:t>
+                  </m:r>
+                </m:e>
+                <m:sub>
+                  <m:r>
+                    <w:rPr>
+                      <w:rFonts w:ascii="Cambria Math" w:eastAsiaTheme="minorEastAsia" w:hAnsi="Cambria Math"/>
+                      <w:sz w:val="24"/>
+                      <w:szCs w:val="24"/>
+                    </w:rPr>
+                    <m:t>2</m:t>
+                  </m:r>
+                </m:sub>
+              </m:sSub>
             </m:e>
           </m:d>
         </m:oMath>
@@ -683,7 +723,7 @@
                   <w:sz w:val="24"/>
                   <w:szCs w:val="24"/>
                 </w:rPr>
-                <m:t>B,O,</m:t>
+                <m:t>B,</m:t>
               </m:r>
               <m:r>
                 <w:rPr>
@@ -763,7 +803,7 @@
                       <w:sz w:val="24"/>
                       <w:szCs w:val="24"/>
                     </w:rPr>
-                    <m:t>1</m:t>
+                    <m:t>2</m:t>
                   </m:r>
                 </m:sub>
               </m:sSub>
@@ -845,2143 +885,7 @@
                   <w:sz w:val="24"/>
                   <w:szCs w:val="24"/>
                 </w:rPr>
-                <m:t>,a,Z</m:t>
-              </m:r>
-            </m:e>
-          </m:d>
-          <m:r>
-            <w:rPr>
-              <w:rFonts w:ascii="Cambria Math" w:eastAsiaTheme="minorEastAsia" w:hAnsi="Cambria Math"/>
-              <w:sz w:val="24"/>
-              <w:szCs w:val="24"/>
-            </w:rPr>
-            <m:t>=</m:t>
-          </m:r>
-          <m:d>
-            <m:dPr>
-              <m:begChr m:val="{"/>
-              <m:endChr m:val="}"/>
-              <m:ctrlPr>
-                <w:rPr>
-                  <w:rFonts w:ascii="Cambria Math" w:eastAsiaTheme="minorEastAsia" w:hAnsi="Cambria Math"/>
-                  <w:i/>
-                  <w:sz w:val="24"/>
-                  <w:szCs w:val="24"/>
-                </w:rPr>
-              </m:ctrlPr>
-            </m:dPr>
-            <m:e>
-              <m:d>
-                <m:dPr>
-                  <m:ctrlPr>
-                    <w:rPr>
-                      <w:rFonts w:ascii="Cambria Math" w:eastAsiaTheme="minorEastAsia" w:hAnsi="Cambria Math"/>
-                      <w:i/>
-                      <w:sz w:val="24"/>
-                      <w:szCs w:val="24"/>
-                    </w:rPr>
-                  </m:ctrlPr>
-                </m:dPr>
-                <m:e>
-                  <m:sSub>
-                    <m:sSubPr>
-                      <m:ctrlPr>
-                        <w:rPr>
-                          <w:rFonts w:ascii="Cambria Math" w:eastAsiaTheme="minorEastAsia" w:hAnsi="Cambria Math"/>
-                          <w:i/>
-                          <w:sz w:val="24"/>
-                          <w:szCs w:val="24"/>
-                        </w:rPr>
-                      </m:ctrlPr>
-                    </m:sSubPr>
-                    <m:e>
-                      <m:r>
-                        <w:rPr>
-                          <w:rFonts w:ascii="Cambria Math" w:eastAsiaTheme="minorEastAsia" w:hAnsi="Cambria Math"/>
-                          <w:sz w:val="24"/>
-                          <w:szCs w:val="24"/>
-                        </w:rPr>
-                        <m:t>q</m:t>
-                      </m:r>
-                    </m:e>
-                    <m:sub>
-                      <m:r>
-                        <w:rPr>
-                          <w:rFonts w:ascii="Cambria Math" w:eastAsiaTheme="minorEastAsia" w:hAnsi="Cambria Math"/>
-                          <w:sz w:val="24"/>
-                          <w:szCs w:val="24"/>
-                        </w:rPr>
-                        <m:t>0</m:t>
-                      </m:r>
-                    </m:sub>
-                  </m:sSub>
-                  <m:r>
-                    <w:rPr>
-                      <w:rFonts w:ascii="Cambria Math" w:eastAsiaTheme="minorEastAsia" w:hAnsi="Cambria Math"/>
-                      <w:sz w:val="24"/>
-                      <w:szCs w:val="24"/>
-                    </w:rPr>
-                    <m:t>,</m:t>
-                  </m:r>
-                  <m:r>
-                    <w:rPr>
-                      <w:rFonts w:ascii="Cambria Math" w:eastAsiaTheme="minorEastAsia" w:hAnsi="Cambria Math"/>
-                      <w:sz w:val="24"/>
-                      <w:szCs w:val="24"/>
-                    </w:rPr>
-                    <m:t>O</m:t>
-                  </m:r>
-                  <m:r>
-                    <w:rPr>
-                      <w:rFonts w:ascii="Cambria Math" w:eastAsiaTheme="minorEastAsia" w:hAnsi="Cambria Math"/>
-                      <w:sz w:val="24"/>
-                      <w:szCs w:val="24"/>
-                    </w:rPr>
-                    <m:t>Z</m:t>
-                  </m:r>
-                </m:e>
-              </m:d>
-            </m:e>
-          </m:d>
-        </m:oMath>
-      </m:oMathPara>
-    </w:p>
-    <w:p>
-      <w:pPr>
-        <w:spacing w:after="0"/>
-        <w:ind w:left="1440"/>
-        <w:rPr>
-          <w:rFonts w:eastAsiaTheme="minorEastAsia"/>
-          <w:sz w:val="24"/>
-          <w:szCs w:val="24"/>
-        </w:rPr>
-      </w:pPr>
-      <m:oMathPara>
-        <m:oMathParaPr>
-          <m:jc m:val="left"/>
-        </m:oMathParaPr>
-        <m:oMath>
-          <m:r>
-            <w:rPr>
-              <w:rFonts w:ascii="Cambria Math" w:eastAsiaTheme="minorEastAsia" w:hAnsi="Cambria Math"/>
-              <w:sz w:val="24"/>
-              <w:szCs w:val="24"/>
-            </w:rPr>
-            <m:t>δ</m:t>
-          </m:r>
-          <m:d>
-            <m:dPr>
-              <m:ctrlPr>
-                <w:rPr>
-                  <w:rFonts w:ascii="Cambria Math" w:eastAsiaTheme="minorEastAsia" w:hAnsi="Cambria Math"/>
-                  <w:i/>
-                  <w:sz w:val="24"/>
-                  <w:szCs w:val="24"/>
-                </w:rPr>
-              </m:ctrlPr>
-            </m:dPr>
-            <m:e>
-              <m:sSub>
-                <m:sSubPr>
-                  <m:ctrlPr>
-                    <w:rPr>
-                      <w:rFonts w:ascii="Cambria Math" w:eastAsiaTheme="minorEastAsia" w:hAnsi="Cambria Math"/>
-                      <w:i/>
-                      <w:sz w:val="24"/>
-                      <w:szCs w:val="24"/>
-                    </w:rPr>
-                  </m:ctrlPr>
-                </m:sSubPr>
-                <m:e>
-                  <m:r>
-                    <w:rPr>
-                      <w:rFonts w:ascii="Cambria Math" w:eastAsiaTheme="minorEastAsia" w:hAnsi="Cambria Math"/>
-                      <w:sz w:val="24"/>
-                      <w:szCs w:val="24"/>
-                    </w:rPr>
-                    <m:t>q</m:t>
-                  </m:r>
-                </m:e>
-                <m:sub>
-                  <m:r>
-                    <w:rPr>
-                      <w:rFonts w:ascii="Cambria Math" w:eastAsiaTheme="minorEastAsia" w:hAnsi="Cambria Math"/>
-                      <w:sz w:val="24"/>
-                      <w:szCs w:val="24"/>
-                    </w:rPr>
-                    <m:t>0</m:t>
-                  </m:r>
-                </m:sub>
-              </m:sSub>
-              <m:r>
-                <w:rPr>
-                  <w:rFonts w:ascii="Cambria Math" w:eastAsiaTheme="minorEastAsia" w:hAnsi="Cambria Math"/>
-                  <w:sz w:val="24"/>
-                  <w:szCs w:val="24"/>
-                </w:rPr>
-                <m:t>,a,</m:t>
-              </m:r>
-              <m:r>
-                <w:rPr>
-                  <w:rFonts w:ascii="Cambria Math" w:eastAsiaTheme="minorEastAsia" w:hAnsi="Cambria Math"/>
-                  <w:sz w:val="24"/>
-                  <w:szCs w:val="24"/>
-                </w:rPr>
-                <m:t>O</m:t>
-              </m:r>
-            </m:e>
-          </m:d>
-          <m:r>
-            <w:rPr>
-              <w:rFonts w:ascii="Cambria Math" w:eastAsiaTheme="minorEastAsia" w:hAnsi="Cambria Math"/>
-              <w:sz w:val="24"/>
-              <w:szCs w:val="24"/>
-            </w:rPr>
-            <m:t>=</m:t>
-          </m:r>
-          <m:d>
-            <m:dPr>
-              <m:begChr m:val="{"/>
-              <m:endChr m:val="}"/>
-              <m:ctrlPr>
-                <w:rPr>
-                  <w:rFonts w:ascii="Cambria Math" w:eastAsiaTheme="minorEastAsia" w:hAnsi="Cambria Math"/>
-                  <w:i/>
-                  <w:sz w:val="24"/>
-                  <w:szCs w:val="24"/>
-                </w:rPr>
-              </m:ctrlPr>
-            </m:dPr>
-            <m:e>
-              <m:d>
-                <m:dPr>
-                  <m:ctrlPr>
-                    <w:rPr>
-                      <w:rFonts w:ascii="Cambria Math" w:eastAsiaTheme="minorEastAsia" w:hAnsi="Cambria Math"/>
-                      <w:i/>
-                      <w:sz w:val="24"/>
-                      <w:szCs w:val="24"/>
-                    </w:rPr>
-                  </m:ctrlPr>
-                </m:dPr>
-                <m:e>
-                  <m:sSub>
-                    <m:sSubPr>
-                      <m:ctrlPr>
-                        <w:rPr>
-                          <w:rFonts w:ascii="Cambria Math" w:eastAsiaTheme="minorEastAsia" w:hAnsi="Cambria Math"/>
-                          <w:i/>
-                          <w:sz w:val="24"/>
-                          <w:szCs w:val="24"/>
-                        </w:rPr>
-                      </m:ctrlPr>
-                    </m:sSubPr>
-                    <m:e>
-                      <m:r>
-                        <w:rPr>
-                          <w:rFonts w:ascii="Cambria Math" w:eastAsiaTheme="minorEastAsia" w:hAnsi="Cambria Math"/>
-                          <w:sz w:val="24"/>
-                          <w:szCs w:val="24"/>
-                        </w:rPr>
-                        <m:t>q</m:t>
-                      </m:r>
-                    </m:e>
-                    <m:sub>
-                      <m:r>
-                        <w:rPr>
-                          <w:rFonts w:ascii="Cambria Math" w:eastAsiaTheme="minorEastAsia" w:hAnsi="Cambria Math"/>
-                          <w:sz w:val="24"/>
-                          <w:szCs w:val="24"/>
-                        </w:rPr>
-                        <m:t>0</m:t>
-                      </m:r>
-                    </m:sub>
-                  </m:sSub>
-                  <m:r>
-                    <w:rPr>
-                      <w:rFonts w:ascii="Cambria Math" w:eastAsiaTheme="minorEastAsia" w:hAnsi="Cambria Math"/>
-                      <w:sz w:val="24"/>
-                      <w:szCs w:val="24"/>
-                    </w:rPr>
-                    <m:t>,</m:t>
-                  </m:r>
-                  <m:r>
-                    <w:rPr>
-                      <w:rFonts w:ascii="Cambria Math" w:eastAsiaTheme="minorEastAsia" w:hAnsi="Cambria Math"/>
-                      <w:sz w:val="24"/>
-                      <w:szCs w:val="24"/>
-                    </w:rPr>
-                    <m:t>AO</m:t>
-                  </m:r>
-                </m:e>
-              </m:d>
-            </m:e>
-          </m:d>
-        </m:oMath>
-      </m:oMathPara>
-    </w:p>
-    <w:p>
-      <w:pPr>
-        <w:spacing w:after="0"/>
-        <w:ind w:left="1440"/>
-        <w:rPr>
-          <w:rFonts w:eastAsiaTheme="minorEastAsia"/>
-          <w:sz w:val="24"/>
-          <w:szCs w:val="24"/>
-        </w:rPr>
-      </w:pPr>
-      <m:oMathPara>
-        <m:oMathParaPr>
-          <m:jc m:val="left"/>
-        </m:oMathParaPr>
-        <m:oMath>
-          <m:r>
-            <w:rPr>
-              <w:rFonts w:ascii="Cambria Math" w:eastAsiaTheme="minorEastAsia" w:hAnsi="Cambria Math"/>
-              <w:sz w:val="24"/>
-              <w:szCs w:val="24"/>
-            </w:rPr>
-            <m:t>δ</m:t>
-          </m:r>
-          <m:d>
-            <m:dPr>
-              <m:ctrlPr>
-                <w:rPr>
-                  <w:rFonts w:ascii="Cambria Math" w:eastAsiaTheme="minorEastAsia" w:hAnsi="Cambria Math"/>
-                  <w:i/>
-                  <w:sz w:val="24"/>
-                  <w:szCs w:val="24"/>
-                </w:rPr>
-              </m:ctrlPr>
-            </m:dPr>
-            <m:e>
-              <m:sSub>
-                <m:sSubPr>
-                  <m:ctrlPr>
-                    <w:rPr>
-                      <w:rFonts w:ascii="Cambria Math" w:eastAsiaTheme="minorEastAsia" w:hAnsi="Cambria Math"/>
-                      <w:i/>
-                      <w:sz w:val="24"/>
-                      <w:szCs w:val="24"/>
-                    </w:rPr>
-                  </m:ctrlPr>
-                </m:sSubPr>
-                <m:e>
-                  <m:r>
-                    <w:rPr>
-                      <w:rFonts w:ascii="Cambria Math" w:eastAsiaTheme="minorEastAsia" w:hAnsi="Cambria Math"/>
-                      <w:sz w:val="24"/>
-                      <w:szCs w:val="24"/>
-                    </w:rPr>
-                    <m:t>q</m:t>
-                  </m:r>
-                </m:e>
-                <m:sub>
-                  <m:r>
-                    <w:rPr>
-                      <w:rFonts w:ascii="Cambria Math" w:eastAsiaTheme="minorEastAsia" w:hAnsi="Cambria Math"/>
-                      <w:sz w:val="24"/>
-                      <w:szCs w:val="24"/>
-                    </w:rPr>
-                    <m:t>0</m:t>
-                  </m:r>
-                </m:sub>
-              </m:sSub>
-              <m:r>
-                <w:rPr>
-                  <w:rFonts w:ascii="Cambria Math" w:eastAsiaTheme="minorEastAsia" w:hAnsi="Cambria Math"/>
-                  <w:sz w:val="24"/>
-                  <w:szCs w:val="24"/>
-                </w:rPr>
-                <m:t>,a,</m:t>
-              </m:r>
-              <m:r>
-                <w:rPr>
-                  <w:rFonts w:ascii="Cambria Math" w:eastAsiaTheme="minorEastAsia" w:hAnsi="Cambria Math"/>
-                  <w:sz w:val="24"/>
-                  <w:szCs w:val="24"/>
-                </w:rPr>
-                <m:t>A</m:t>
-              </m:r>
-            </m:e>
-          </m:d>
-          <m:r>
-            <w:rPr>
-              <w:rFonts w:ascii="Cambria Math" w:eastAsiaTheme="minorEastAsia" w:hAnsi="Cambria Math"/>
-              <w:sz w:val="24"/>
-              <w:szCs w:val="24"/>
-            </w:rPr>
-            <m:t>=</m:t>
-          </m:r>
-          <m:d>
-            <m:dPr>
-              <m:begChr m:val="{"/>
-              <m:endChr m:val="}"/>
-              <m:ctrlPr>
-                <w:rPr>
-                  <w:rFonts w:ascii="Cambria Math" w:eastAsiaTheme="minorEastAsia" w:hAnsi="Cambria Math"/>
-                  <w:i/>
-                  <w:sz w:val="24"/>
-                  <w:szCs w:val="24"/>
-                </w:rPr>
-              </m:ctrlPr>
-            </m:dPr>
-            <m:e>
-              <m:d>
-                <m:dPr>
-                  <m:ctrlPr>
-                    <w:rPr>
-                      <w:rFonts w:ascii="Cambria Math" w:eastAsiaTheme="minorEastAsia" w:hAnsi="Cambria Math"/>
-                      <w:i/>
-                      <w:sz w:val="24"/>
-                      <w:szCs w:val="24"/>
-                    </w:rPr>
-                  </m:ctrlPr>
-                </m:dPr>
-                <m:e>
-                  <m:sSub>
-                    <m:sSubPr>
-                      <m:ctrlPr>
-                        <w:rPr>
-                          <w:rFonts w:ascii="Cambria Math" w:eastAsiaTheme="minorEastAsia" w:hAnsi="Cambria Math"/>
-                          <w:i/>
-                          <w:sz w:val="24"/>
-                          <w:szCs w:val="24"/>
-                        </w:rPr>
-                      </m:ctrlPr>
-                    </m:sSubPr>
-                    <m:e>
-                      <m:r>
-                        <w:rPr>
-                          <w:rFonts w:ascii="Cambria Math" w:eastAsiaTheme="minorEastAsia" w:hAnsi="Cambria Math"/>
-                          <w:sz w:val="24"/>
-                          <w:szCs w:val="24"/>
-                        </w:rPr>
-                        <m:t>q</m:t>
-                      </m:r>
-                    </m:e>
-                    <m:sub>
-                      <m:r>
-                        <w:rPr>
-                          <w:rFonts w:ascii="Cambria Math" w:eastAsiaTheme="minorEastAsia" w:hAnsi="Cambria Math"/>
-                          <w:sz w:val="24"/>
-                          <w:szCs w:val="24"/>
-                        </w:rPr>
-                        <m:t>0</m:t>
-                      </m:r>
-                    </m:sub>
-                  </m:sSub>
-                  <m:r>
-                    <w:rPr>
-                      <w:rFonts w:ascii="Cambria Math" w:eastAsiaTheme="minorEastAsia" w:hAnsi="Cambria Math"/>
-                      <w:sz w:val="24"/>
-                      <w:szCs w:val="24"/>
-                    </w:rPr>
-                    <m:t>,A</m:t>
-                  </m:r>
-                  <m:r>
-                    <w:rPr>
-                      <w:rFonts w:ascii="Cambria Math" w:eastAsiaTheme="minorEastAsia" w:hAnsi="Cambria Math"/>
-                      <w:sz w:val="24"/>
-                      <w:szCs w:val="24"/>
-                    </w:rPr>
-                    <m:t>A</m:t>
-                  </m:r>
-                </m:e>
-              </m:d>
-            </m:e>
-          </m:d>
-        </m:oMath>
-      </m:oMathPara>
-    </w:p>
-    <w:p>
-      <w:pPr>
-        <w:spacing w:after="0"/>
-        <w:ind w:left="1440"/>
-        <w:rPr>
-          <w:rFonts w:eastAsiaTheme="minorEastAsia"/>
-          <w:sz w:val="24"/>
-          <w:szCs w:val="24"/>
-        </w:rPr>
-      </w:pPr>
-      <m:oMathPara>
-        <m:oMathParaPr>
-          <m:jc m:val="left"/>
-        </m:oMathParaPr>
-        <m:oMath>
-          <m:r>
-            <w:rPr>
-              <w:rFonts w:ascii="Cambria Math" w:eastAsiaTheme="minorEastAsia" w:hAnsi="Cambria Math"/>
-              <w:sz w:val="24"/>
-              <w:szCs w:val="24"/>
-            </w:rPr>
-            <m:t>δ</m:t>
-          </m:r>
-          <m:d>
-            <m:dPr>
-              <m:ctrlPr>
-                <w:rPr>
-                  <w:rFonts w:ascii="Cambria Math" w:eastAsiaTheme="minorEastAsia" w:hAnsi="Cambria Math"/>
-                  <w:i/>
-                  <w:sz w:val="24"/>
-                  <w:szCs w:val="24"/>
-                </w:rPr>
-              </m:ctrlPr>
-            </m:dPr>
-            <m:e>
-              <m:sSub>
-                <m:sSubPr>
-                  <m:ctrlPr>
-                    <w:rPr>
-                      <w:rFonts w:ascii="Cambria Math" w:eastAsiaTheme="minorEastAsia" w:hAnsi="Cambria Math"/>
-                      <w:i/>
-                      <w:sz w:val="24"/>
-                      <w:szCs w:val="24"/>
-                    </w:rPr>
-                  </m:ctrlPr>
-                </m:sSubPr>
-                <m:e>
-                  <m:r>
-                    <w:rPr>
-                      <w:rFonts w:ascii="Cambria Math" w:eastAsiaTheme="minorEastAsia" w:hAnsi="Cambria Math"/>
-                      <w:sz w:val="24"/>
-                      <w:szCs w:val="24"/>
-                    </w:rPr>
-                    <m:t>q</m:t>
-                  </m:r>
-                </m:e>
-                <m:sub>
-                  <m:r>
-                    <w:rPr>
-                      <w:rFonts w:ascii="Cambria Math" w:eastAsiaTheme="minorEastAsia" w:hAnsi="Cambria Math"/>
-                      <w:sz w:val="24"/>
-                      <w:szCs w:val="24"/>
-                    </w:rPr>
-                    <m:t>0</m:t>
-                  </m:r>
-                </m:sub>
-              </m:sSub>
-              <m:r>
-                <w:rPr>
-                  <w:rFonts w:ascii="Cambria Math" w:eastAsiaTheme="minorEastAsia" w:hAnsi="Cambria Math"/>
-                  <w:sz w:val="24"/>
-                  <w:szCs w:val="24"/>
-                </w:rPr>
-                <m:t>,a,</m:t>
-              </m:r>
-              <m:r>
-                <w:rPr>
-                  <w:rFonts w:ascii="Cambria Math" w:eastAsiaTheme="minorEastAsia" w:hAnsi="Cambria Math"/>
-                  <w:sz w:val="24"/>
-                  <w:szCs w:val="24"/>
-                </w:rPr>
-                <m:t>B</m:t>
-              </m:r>
-            </m:e>
-          </m:d>
-          <m:r>
-            <w:rPr>
-              <w:rFonts w:ascii="Cambria Math" w:eastAsiaTheme="minorEastAsia" w:hAnsi="Cambria Math"/>
-              <w:sz w:val="24"/>
-              <w:szCs w:val="24"/>
-            </w:rPr>
-            <m:t>=</m:t>
-          </m:r>
-          <m:d>
-            <m:dPr>
-              <m:begChr m:val="{"/>
-              <m:endChr m:val="}"/>
-              <m:ctrlPr>
-                <w:rPr>
-                  <w:rFonts w:ascii="Cambria Math" w:eastAsiaTheme="minorEastAsia" w:hAnsi="Cambria Math"/>
-                  <w:i/>
-                  <w:sz w:val="24"/>
-                  <w:szCs w:val="24"/>
-                </w:rPr>
-              </m:ctrlPr>
-            </m:dPr>
-            <m:e>
-              <m:d>
-                <m:dPr>
-                  <m:ctrlPr>
-                    <w:rPr>
-                      <w:rFonts w:ascii="Cambria Math" w:eastAsiaTheme="minorEastAsia" w:hAnsi="Cambria Math"/>
-                      <w:i/>
-                      <w:sz w:val="24"/>
-                      <w:szCs w:val="24"/>
-                    </w:rPr>
-                  </m:ctrlPr>
-                </m:dPr>
-                <m:e>
-                  <m:sSub>
-                    <m:sSubPr>
-                      <m:ctrlPr>
-                        <w:rPr>
-                          <w:rFonts w:ascii="Cambria Math" w:eastAsiaTheme="minorEastAsia" w:hAnsi="Cambria Math"/>
-                          <w:i/>
-                          <w:sz w:val="24"/>
-                          <w:szCs w:val="24"/>
-                        </w:rPr>
-                      </m:ctrlPr>
-                    </m:sSubPr>
-                    <m:e>
-                      <m:r>
-                        <w:rPr>
-                          <w:rFonts w:ascii="Cambria Math" w:eastAsiaTheme="minorEastAsia" w:hAnsi="Cambria Math"/>
-                          <w:sz w:val="24"/>
-                          <w:szCs w:val="24"/>
-                        </w:rPr>
-                        <m:t>q</m:t>
-                      </m:r>
-                    </m:e>
-                    <m:sub>
-                      <m:r>
-                        <w:rPr>
-                          <w:rFonts w:ascii="Cambria Math" w:eastAsiaTheme="minorEastAsia" w:hAnsi="Cambria Math"/>
-                          <w:sz w:val="24"/>
-                          <w:szCs w:val="24"/>
-                        </w:rPr>
-                        <m:t>0</m:t>
-                      </m:r>
-                    </m:sub>
-                  </m:sSub>
-                  <m:r>
-                    <w:rPr>
-                      <w:rFonts w:ascii="Cambria Math" w:eastAsiaTheme="minorEastAsia" w:hAnsi="Cambria Math"/>
-                      <w:sz w:val="24"/>
-                      <w:szCs w:val="24"/>
-                    </w:rPr>
-                    <m:t>,</m:t>
-                  </m:r>
-                  <m:r>
-                    <w:rPr>
-                      <w:rFonts w:ascii="Cambria Math" w:eastAsiaTheme="minorEastAsia" w:hAnsi="Cambria Math"/>
-                      <w:sz w:val="24"/>
-                      <w:szCs w:val="24"/>
-                    </w:rPr>
-                    <m:t>λ</m:t>
-                  </m:r>
-                </m:e>
-              </m:d>
-            </m:e>
-          </m:d>
-        </m:oMath>
-      </m:oMathPara>
-    </w:p>
-    <w:p>
-      <w:pPr>
-        <w:spacing w:after="0"/>
-        <w:ind w:left="1440"/>
-        <w:rPr>
-          <w:rFonts w:eastAsiaTheme="minorEastAsia"/>
-          <w:sz w:val="24"/>
-          <w:szCs w:val="24"/>
-        </w:rPr>
-      </w:pPr>
-      <m:oMathPara>
-        <m:oMathParaPr>
-          <m:jc m:val="left"/>
-        </m:oMathParaPr>
-        <m:oMath>
-          <m:r>
-            <w:rPr>
-              <w:rFonts w:ascii="Cambria Math" w:eastAsiaTheme="minorEastAsia" w:hAnsi="Cambria Math"/>
-              <w:sz w:val="24"/>
-              <w:szCs w:val="24"/>
-            </w:rPr>
-            <m:t>δ</m:t>
-          </m:r>
-          <m:d>
-            <m:dPr>
-              <m:ctrlPr>
-                <w:rPr>
-                  <w:rFonts w:ascii="Cambria Math" w:eastAsiaTheme="minorEastAsia" w:hAnsi="Cambria Math"/>
-                  <w:i/>
-                  <w:sz w:val="24"/>
-                  <w:szCs w:val="24"/>
-                </w:rPr>
-              </m:ctrlPr>
-            </m:dPr>
-            <m:e>
-              <m:sSub>
-                <m:sSubPr>
-                  <m:ctrlPr>
-                    <w:rPr>
-                      <w:rFonts w:ascii="Cambria Math" w:eastAsiaTheme="minorEastAsia" w:hAnsi="Cambria Math"/>
-                      <w:i/>
-                      <w:sz w:val="24"/>
-                      <w:szCs w:val="24"/>
-                    </w:rPr>
-                  </m:ctrlPr>
-                </m:sSubPr>
-                <m:e>
-                  <m:r>
-                    <w:rPr>
-                      <w:rFonts w:ascii="Cambria Math" w:eastAsiaTheme="minorEastAsia" w:hAnsi="Cambria Math"/>
-                      <w:sz w:val="24"/>
-                      <w:szCs w:val="24"/>
-                    </w:rPr>
-                    <m:t>q</m:t>
-                  </m:r>
-                </m:e>
-                <m:sub>
-                  <m:r>
-                    <w:rPr>
-                      <w:rFonts w:ascii="Cambria Math" w:eastAsiaTheme="minorEastAsia" w:hAnsi="Cambria Math"/>
-                      <w:sz w:val="24"/>
-                      <w:szCs w:val="24"/>
-                    </w:rPr>
-                    <m:t>0</m:t>
-                  </m:r>
-                </m:sub>
-              </m:sSub>
-              <m:r>
-                <w:rPr>
-                  <w:rFonts w:ascii="Cambria Math" w:eastAsiaTheme="minorEastAsia" w:hAnsi="Cambria Math"/>
-                  <w:sz w:val="24"/>
-                  <w:szCs w:val="24"/>
-                </w:rPr>
-                <m:t>,</m:t>
-              </m:r>
-              <m:r>
-                <w:rPr>
-                  <w:rFonts w:ascii="Cambria Math" w:eastAsiaTheme="minorEastAsia" w:hAnsi="Cambria Math"/>
-                  <w:sz w:val="24"/>
-                  <w:szCs w:val="24"/>
-                </w:rPr>
-                <m:t>b</m:t>
-              </m:r>
-              <m:r>
-                <w:rPr>
-                  <w:rFonts w:ascii="Cambria Math" w:eastAsiaTheme="minorEastAsia" w:hAnsi="Cambria Math"/>
-                  <w:sz w:val="24"/>
-                  <w:szCs w:val="24"/>
-                </w:rPr>
-                <m:t>,Z</m:t>
-              </m:r>
-            </m:e>
-          </m:d>
-          <m:r>
-            <w:rPr>
-              <w:rFonts w:ascii="Cambria Math" w:eastAsiaTheme="minorEastAsia" w:hAnsi="Cambria Math"/>
-              <w:sz w:val="24"/>
-              <w:szCs w:val="24"/>
-            </w:rPr>
-            <m:t>=</m:t>
-          </m:r>
-          <m:d>
-            <m:dPr>
-              <m:begChr m:val="{"/>
-              <m:endChr m:val="}"/>
-              <m:ctrlPr>
-                <w:rPr>
-                  <w:rFonts w:ascii="Cambria Math" w:eastAsiaTheme="minorEastAsia" w:hAnsi="Cambria Math"/>
-                  <w:i/>
-                  <w:sz w:val="24"/>
-                  <w:szCs w:val="24"/>
-                </w:rPr>
-              </m:ctrlPr>
-            </m:dPr>
-            <m:e>
-              <m:d>
-                <m:dPr>
-                  <m:ctrlPr>
-                    <w:rPr>
-                      <w:rFonts w:ascii="Cambria Math" w:eastAsiaTheme="minorEastAsia" w:hAnsi="Cambria Math"/>
-                      <w:i/>
-                      <w:sz w:val="24"/>
-                      <w:szCs w:val="24"/>
-                    </w:rPr>
-                  </m:ctrlPr>
-                </m:dPr>
-                <m:e>
-                  <m:sSub>
-                    <m:sSubPr>
-                      <m:ctrlPr>
-                        <w:rPr>
-                          <w:rFonts w:ascii="Cambria Math" w:eastAsiaTheme="minorEastAsia" w:hAnsi="Cambria Math"/>
-                          <w:i/>
-                          <w:sz w:val="24"/>
-                          <w:szCs w:val="24"/>
-                        </w:rPr>
-                      </m:ctrlPr>
-                    </m:sSubPr>
-                    <m:e>
-                      <m:r>
-                        <w:rPr>
-                          <w:rFonts w:ascii="Cambria Math" w:eastAsiaTheme="minorEastAsia" w:hAnsi="Cambria Math"/>
-                          <w:sz w:val="24"/>
-                          <w:szCs w:val="24"/>
-                        </w:rPr>
-                        <m:t>q</m:t>
-                      </m:r>
-                    </m:e>
-                    <m:sub>
-                      <m:r>
-                        <w:rPr>
-                          <w:rFonts w:ascii="Cambria Math" w:eastAsiaTheme="minorEastAsia" w:hAnsi="Cambria Math"/>
-                          <w:sz w:val="24"/>
-                          <w:szCs w:val="24"/>
-                        </w:rPr>
-                        <m:t>0</m:t>
-                      </m:r>
-                    </m:sub>
-                  </m:sSub>
-                  <m:r>
-                    <w:rPr>
-                      <w:rFonts w:ascii="Cambria Math" w:eastAsiaTheme="minorEastAsia" w:hAnsi="Cambria Math"/>
-                      <w:sz w:val="24"/>
-                      <w:szCs w:val="24"/>
-                    </w:rPr>
-                    <m:t>,</m:t>
-                  </m:r>
-                  <m:r>
-                    <w:rPr>
-                      <w:rFonts w:ascii="Cambria Math" w:eastAsiaTheme="minorEastAsia" w:hAnsi="Cambria Math"/>
-                      <w:sz w:val="24"/>
-                      <w:szCs w:val="24"/>
-                    </w:rPr>
-                    <m:t>B</m:t>
-                  </m:r>
-                  <m:r>
-                    <w:rPr>
-                      <w:rFonts w:ascii="Cambria Math" w:eastAsiaTheme="minorEastAsia" w:hAnsi="Cambria Math"/>
-                      <w:sz w:val="24"/>
-                      <w:szCs w:val="24"/>
-                    </w:rPr>
-                    <m:t>Z</m:t>
-                  </m:r>
-                </m:e>
-              </m:d>
-            </m:e>
-          </m:d>
-        </m:oMath>
-      </m:oMathPara>
-    </w:p>
-    <w:p>
-      <w:pPr>
-        <w:spacing w:after="0"/>
-        <w:ind w:left="1440"/>
-        <w:rPr>
-          <w:rFonts w:eastAsiaTheme="minorEastAsia"/>
-          <w:sz w:val="24"/>
-          <w:szCs w:val="24"/>
-        </w:rPr>
-      </w:pPr>
-      <m:oMathPara>
-        <m:oMathParaPr>
-          <m:jc m:val="left"/>
-        </m:oMathParaPr>
-        <m:oMath>
-          <m:r>
-            <w:rPr>
-              <w:rFonts w:ascii="Cambria Math" w:eastAsiaTheme="minorEastAsia" w:hAnsi="Cambria Math"/>
-              <w:sz w:val="24"/>
-              <w:szCs w:val="24"/>
-            </w:rPr>
-            <m:t>δ</m:t>
-          </m:r>
-          <m:d>
-            <m:dPr>
-              <m:ctrlPr>
-                <w:rPr>
-                  <w:rFonts w:ascii="Cambria Math" w:eastAsiaTheme="minorEastAsia" w:hAnsi="Cambria Math"/>
-                  <w:i/>
-                  <w:sz w:val="24"/>
-                  <w:szCs w:val="24"/>
-                </w:rPr>
-              </m:ctrlPr>
-            </m:dPr>
-            <m:e>
-              <m:sSub>
-                <m:sSubPr>
-                  <m:ctrlPr>
-                    <w:rPr>
-                      <w:rFonts w:ascii="Cambria Math" w:eastAsiaTheme="minorEastAsia" w:hAnsi="Cambria Math"/>
-                      <w:i/>
-                      <w:sz w:val="24"/>
-                      <w:szCs w:val="24"/>
-                    </w:rPr>
-                  </m:ctrlPr>
-                </m:sSubPr>
-                <m:e>
-                  <m:r>
-                    <w:rPr>
-                      <w:rFonts w:ascii="Cambria Math" w:eastAsiaTheme="minorEastAsia" w:hAnsi="Cambria Math"/>
-                      <w:sz w:val="24"/>
-                      <w:szCs w:val="24"/>
-                    </w:rPr>
-                    <m:t>q</m:t>
-                  </m:r>
-                </m:e>
-                <m:sub>
-                  <m:r>
-                    <w:rPr>
-                      <w:rFonts w:ascii="Cambria Math" w:eastAsiaTheme="minorEastAsia" w:hAnsi="Cambria Math"/>
-                      <w:sz w:val="24"/>
-                      <w:szCs w:val="24"/>
-                    </w:rPr>
-                    <m:t>0</m:t>
-                  </m:r>
-                </m:sub>
-              </m:sSub>
-              <m:r>
-                <w:rPr>
-                  <w:rFonts w:ascii="Cambria Math" w:eastAsiaTheme="minorEastAsia" w:hAnsi="Cambria Math"/>
-                  <w:sz w:val="24"/>
-                  <w:szCs w:val="24"/>
-                </w:rPr>
-                <m:t>,b,</m:t>
-              </m:r>
-              <m:r>
-                <w:rPr>
-                  <w:rFonts w:ascii="Cambria Math" w:eastAsiaTheme="minorEastAsia" w:hAnsi="Cambria Math"/>
-                  <w:sz w:val="24"/>
-                  <w:szCs w:val="24"/>
-                </w:rPr>
-                <m:t>O</m:t>
-              </m:r>
-            </m:e>
-          </m:d>
-          <m:r>
-            <w:rPr>
-              <w:rFonts w:ascii="Cambria Math" w:eastAsiaTheme="minorEastAsia" w:hAnsi="Cambria Math"/>
-              <w:sz w:val="24"/>
-              <w:szCs w:val="24"/>
-            </w:rPr>
-            <m:t>=</m:t>
-          </m:r>
-          <m:d>
-            <m:dPr>
-              <m:begChr m:val="{"/>
-              <m:endChr m:val="}"/>
-              <m:ctrlPr>
-                <w:rPr>
-                  <w:rFonts w:ascii="Cambria Math" w:eastAsiaTheme="minorEastAsia" w:hAnsi="Cambria Math"/>
-                  <w:i/>
-                  <w:sz w:val="24"/>
-                  <w:szCs w:val="24"/>
-                </w:rPr>
-              </m:ctrlPr>
-            </m:dPr>
-            <m:e>
-              <m:d>
-                <m:dPr>
-                  <m:ctrlPr>
-                    <w:rPr>
-                      <w:rFonts w:ascii="Cambria Math" w:eastAsiaTheme="minorEastAsia" w:hAnsi="Cambria Math"/>
-                      <w:i/>
-                      <w:sz w:val="24"/>
-                      <w:szCs w:val="24"/>
-                    </w:rPr>
-                  </m:ctrlPr>
-                </m:dPr>
-                <m:e>
-                  <m:sSub>
-                    <m:sSubPr>
-                      <m:ctrlPr>
-                        <w:rPr>
-                          <w:rFonts w:ascii="Cambria Math" w:eastAsiaTheme="minorEastAsia" w:hAnsi="Cambria Math"/>
-                          <w:i/>
-                          <w:sz w:val="24"/>
-                          <w:szCs w:val="24"/>
-                        </w:rPr>
-                      </m:ctrlPr>
-                    </m:sSubPr>
-                    <m:e>
-                      <m:r>
-                        <w:rPr>
-                          <w:rFonts w:ascii="Cambria Math" w:eastAsiaTheme="minorEastAsia" w:hAnsi="Cambria Math"/>
-                          <w:sz w:val="24"/>
-                          <w:szCs w:val="24"/>
-                        </w:rPr>
-                        <m:t>q</m:t>
-                      </m:r>
-                    </m:e>
-                    <m:sub>
-                      <m:r>
-                        <w:rPr>
-                          <w:rFonts w:ascii="Cambria Math" w:eastAsiaTheme="minorEastAsia" w:hAnsi="Cambria Math"/>
-                          <w:sz w:val="24"/>
-                          <w:szCs w:val="24"/>
-                        </w:rPr>
-                        <m:t>0</m:t>
-                      </m:r>
-                    </m:sub>
-                  </m:sSub>
-                  <m:r>
-                    <w:rPr>
-                      <w:rFonts w:ascii="Cambria Math" w:eastAsiaTheme="minorEastAsia" w:hAnsi="Cambria Math"/>
-                      <w:sz w:val="24"/>
-                      <w:szCs w:val="24"/>
-                    </w:rPr>
-                    <m:t>,</m:t>
-                  </m:r>
-                  <m:r>
-                    <w:rPr>
-                      <w:rFonts w:ascii="Cambria Math" w:eastAsiaTheme="minorEastAsia" w:hAnsi="Cambria Math"/>
-                      <w:sz w:val="24"/>
-                      <w:szCs w:val="24"/>
-                    </w:rPr>
-                    <m:t>λ</m:t>
-                  </m:r>
-                </m:e>
-              </m:d>
-            </m:e>
-          </m:d>
-        </m:oMath>
-      </m:oMathPara>
-    </w:p>
-    <w:p>
-      <w:pPr>
-        <w:spacing w:after="0"/>
-        <w:ind w:left="1440"/>
-        <w:rPr>
-          <w:rFonts w:eastAsiaTheme="minorEastAsia"/>
-          <w:sz w:val="24"/>
-          <w:szCs w:val="24"/>
-        </w:rPr>
-      </w:pPr>
-      <m:oMathPara>
-        <m:oMathParaPr>
-          <m:jc m:val="left"/>
-        </m:oMathParaPr>
-        <m:oMath>
-          <m:r>
-            <w:rPr>
-              <w:rFonts w:ascii="Cambria Math" w:eastAsiaTheme="minorEastAsia" w:hAnsi="Cambria Math"/>
-              <w:sz w:val="24"/>
-              <w:szCs w:val="24"/>
-            </w:rPr>
-            <m:t>δ</m:t>
-          </m:r>
-          <m:d>
-            <m:dPr>
-              <m:ctrlPr>
-                <w:rPr>
-                  <w:rFonts w:ascii="Cambria Math" w:eastAsiaTheme="minorEastAsia" w:hAnsi="Cambria Math"/>
-                  <w:i/>
-                  <w:sz w:val="24"/>
-                  <w:szCs w:val="24"/>
-                </w:rPr>
-              </m:ctrlPr>
-            </m:dPr>
-            <m:e>
-              <m:sSub>
-                <m:sSubPr>
-                  <m:ctrlPr>
-                    <w:rPr>
-                      <w:rFonts w:ascii="Cambria Math" w:eastAsiaTheme="minorEastAsia" w:hAnsi="Cambria Math"/>
-                      <w:i/>
-                      <w:sz w:val="24"/>
-                      <w:szCs w:val="24"/>
-                    </w:rPr>
-                  </m:ctrlPr>
-                </m:sSubPr>
-                <m:e>
-                  <m:r>
-                    <w:rPr>
-                      <w:rFonts w:ascii="Cambria Math" w:eastAsiaTheme="minorEastAsia" w:hAnsi="Cambria Math"/>
-                      <w:sz w:val="24"/>
-                      <w:szCs w:val="24"/>
-                    </w:rPr>
-                    <m:t>q</m:t>
-                  </m:r>
-                </m:e>
-                <m:sub>
-                  <m:r>
-                    <w:rPr>
-                      <w:rFonts w:ascii="Cambria Math" w:eastAsiaTheme="minorEastAsia" w:hAnsi="Cambria Math"/>
-                      <w:sz w:val="24"/>
-                      <w:szCs w:val="24"/>
-                    </w:rPr>
-                    <m:t>0</m:t>
-                  </m:r>
-                </m:sub>
-              </m:sSub>
-              <m:r>
-                <w:rPr>
-                  <w:rFonts w:ascii="Cambria Math" w:eastAsiaTheme="minorEastAsia" w:hAnsi="Cambria Math"/>
-                  <w:sz w:val="24"/>
-                  <w:szCs w:val="24"/>
-                </w:rPr>
-                <m:t>,b,</m:t>
-              </m:r>
-              <m:r>
-                <w:rPr>
-                  <w:rFonts w:ascii="Cambria Math" w:eastAsiaTheme="minorEastAsia" w:hAnsi="Cambria Math"/>
-                  <w:sz w:val="24"/>
-                  <w:szCs w:val="24"/>
-                </w:rPr>
-                <m:t>A</m:t>
-              </m:r>
-            </m:e>
-          </m:d>
-          <m:r>
-            <w:rPr>
-              <w:rFonts w:ascii="Cambria Math" w:eastAsiaTheme="minorEastAsia" w:hAnsi="Cambria Math"/>
-              <w:sz w:val="24"/>
-              <w:szCs w:val="24"/>
-            </w:rPr>
-            <m:t>=</m:t>
-          </m:r>
-          <m:d>
-            <m:dPr>
-              <m:begChr m:val="{"/>
-              <m:endChr m:val="}"/>
-              <m:ctrlPr>
-                <w:rPr>
-                  <w:rFonts w:ascii="Cambria Math" w:eastAsiaTheme="minorEastAsia" w:hAnsi="Cambria Math"/>
-                  <w:i/>
-                  <w:sz w:val="24"/>
-                  <w:szCs w:val="24"/>
-                </w:rPr>
-              </m:ctrlPr>
-            </m:dPr>
-            <m:e>
-              <m:d>
-                <m:dPr>
-                  <m:ctrlPr>
-                    <w:rPr>
-                      <w:rFonts w:ascii="Cambria Math" w:eastAsiaTheme="minorEastAsia" w:hAnsi="Cambria Math"/>
-                      <w:i/>
-                      <w:sz w:val="24"/>
-                      <w:szCs w:val="24"/>
-                    </w:rPr>
-                  </m:ctrlPr>
-                </m:dPr>
-                <m:e>
-                  <m:sSub>
-                    <m:sSubPr>
-                      <m:ctrlPr>
-                        <w:rPr>
-                          <w:rFonts w:ascii="Cambria Math" w:eastAsiaTheme="minorEastAsia" w:hAnsi="Cambria Math"/>
-                          <w:i/>
-                          <w:sz w:val="24"/>
-                          <w:szCs w:val="24"/>
-                        </w:rPr>
-                      </m:ctrlPr>
-                    </m:sSubPr>
-                    <m:e>
-                      <m:r>
-                        <w:rPr>
-                          <w:rFonts w:ascii="Cambria Math" w:eastAsiaTheme="minorEastAsia" w:hAnsi="Cambria Math"/>
-                          <w:sz w:val="24"/>
-                          <w:szCs w:val="24"/>
-                        </w:rPr>
-                        <m:t>q</m:t>
-                      </m:r>
-                    </m:e>
-                    <m:sub>
-                      <m:r>
-                        <w:rPr>
-                          <w:rFonts w:ascii="Cambria Math" w:eastAsiaTheme="minorEastAsia" w:hAnsi="Cambria Math"/>
-                          <w:sz w:val="24"/>
-                          <w:szCs w:val="24"/>
-                        </w:rPr>
-                        <m:t>0</m:t>
-                      </m:r>
-                    </m:sub>
-                  </m:sSub>
-                  <m:r>
-                    <w:rPr>
-                      <w:rFonts w:ascii="Cambria Math" w:eastAsiaTheme="minorEastAsia" w:hAnsi="Cambria Math"/>
-                      <w:sz w:val="24"/>
-                      <w:szCs w:val="24"/>
-                    </w:rPr>
-                    <m:t>,λ</m:t>
-                  </m:r>
-                </m:e>
-              </m:d>
-            </m:e>
-          </m:d>
-        </m:oMath>
-      </m:oMathPara>
-    </w:p>
-    <w:p>
-      <w:pPr>
-        <w:spacing w:after="0"/>
-        <w:ind w:left="1440"/>
-        <w:rPr>
-          <w:rFonts w:eastAsiaTheme="minorEastAsia"/>
-          <w:sz w:val="24"/>
-          <w:szCs w:val="24"/>
-        </w:rPr>
-      </w:pPr>
-      <m:oMathPara>
-        <m:oMathParaPr>
-          <m:jc m:val="left"/>
-        </m:oMathParaPr>
-        <m:oMath>
-          <m:r>
-            <w:rPr>
-              <w:rFonts w:ascii="Cambria Math" w:eastAsiaTheme="minorEastAsia" w:hAnsi="Cambria Math"/>
-              <w:sz w:val="24"/>
-              <w:szCs w:val="24"/>
-            </w:rPr>
-            <m:t>δ</m:t>
-          </m:r>
-          <m:d>
-            <m:dPr>
-              <m:ctrlPr>
-                <w:rPr>
-                  <w:rFonts w:ascii="Cambria Math" w:eastAsiaTheme="minorEastAsia" w:hAnsi="Cambria Math"/>
-                  <w:i/>
-                  <w:sz w:val="24"/>
-                  <w:szCs w:val="24"/>
-                </w:rPr>
-              </m:ctrlPr>
-            </m:dPr>
-            <m:e>
-              <m:sSub>
-                <m:sSubPr>
-                  <m:ctrlPr>
-                    <w:rPr>
-                      <w:rFonts w:ascii="Cambria Math" w:eastAsiaTheme="minorEastAsia" w:hAnsi="Cambria Math"/>
-                      <w:i/>
-                      <w:sz w:val="24"/>
-                      <w:szCs w:val="24"/>
-                    </w:rPr>
-                  </m:ctrlPr>
-                </m:sSubPr>
-                <m:e>
-                  <m:r>
-                    <w:rPr>
-                      <w:rFonts w:ascii="Cambria Math" w:eastAsiaTheme="minorEastAsia" w:hAnsi="Cambria Math"/>
-                      <w:sz w:val="24"/>
-                      <w:szCs w:val="24"/>
-                    </w:rPr>
-                    <m:t>q</m:t>
-                  </m:r>
-                </m:e>
-                <m:sub>
-                  <m:r>
-                    <w:rPr>
-                      <w:rFonts w:ascii="Cambria Math" w:eastAsiaTheme="minorEastAsia" w:hAnsi="Cambria Math"/>
-                      <w:sz w:val="24"/>
-                      <w:szCs w:val="24"/>
-                    </w:rPr>
-                    <m:t>0</m:t>
-                  </m:r>
-                </m:sub>
-              </m:sSub>
-              <m:r>
-                <w:rPr>
-                  <w:rFonts w:ascii="Cambria Math" w:eastAsiaTheme="minorEastAsia" w:hAnsi="Cambria Math"/>
-                  <w:sz w:val="24"/>
-                  <w:szCs w:val="24"/>
-                </w:rPr>
-                <m:t>,b,</m:t>
-              </m:r>
-              <m:r>
-                <w:rPr>
-                  <w:rFonts w:ascii="Cambria Math" w:eastAsiaTheme="minorEastAsia" w:hAnsi="Cambria Math"/>
-                  <w:sz w:val="24"/>
-                  <w:szCs w:val="24"/>
-                </w:rPr>
-                <m:t>B</m:t>
-              </m:r>
-            </m:e>
-          </m:d>
-          <m:r>
-            <w:rPr>
-              <w:rFonts w:ascii="Cambria Math" w:eastAsiaTheme="minorEastAsia" w:hAnsi="Cambria Math"/>
-              <w:sz w:val="24"/>
-              <w:szCs w:val="24"/>
-            </w:rPr>
-            <m:t>=</m:t>
-          </m:r>
-          <m:d>
-            <m:dPr>
-              <m:begChr m:val="{"/>
-              <m:endChr m:val="}"/>
-              <m:ctrlPr>
-                <w:rPr>
-                  <w:rFonts w:ascii="Cambria Math" w:eastAsiaTheme="minorEastAsia" w:hAnsi="Cambria Math"/>
-                  <w:i/>
-                  <w:sz w:val="24"/>
-                  <w:szCs w:val="24"/>
-                </w:rPr>
-              </m:ctrlPr>
-            </m:dPr>
-            <m:e>
-              <m:d>
-                <m:dPr>
-                  <m:ctrlPr>
-                    <w:rPr>
-                      <w:rFonts w:ascii="Cambria Math" w:eastAsiaTheme="minorEastAsia" w:hAnsi="Cambria Math"/>
-                      <w:i/>
-                      <w:sz w:val="24"/>
-                      <w:szCs w:val="24"/>
-                    </w:rPr>
-                  </m:ctrlPr>
-                </m:dPr>
-                <m:e>
-                  <m:sSub>
-                    <m:sSubPr>
-                      <m:ctrlPr>
-                        <w:rPr>
-                          <w:rFonts w:ascii="Cambria Math" w:eastAsiaTheme="minorEastAsia" w:hAnsi="Cambria Math"/>
-                          <w:i/>
-                          <w:sz w:val="24"/>
-                          <w:szCs w:val="24"/>
-                        </w:rPr>
-                      </m:ctrlPr>
-                    </m:sSubPr>
-                    <m:e>
-                      <m:r>
-                        <w:rPr>
-                          <w:rFonts w:ascii="Cambria Math" w:eastAsiaTheme="minorEastAsia" w:hAnsi="Cambria Math"/>
-                          <w:sz w:val="24"/>
-                          <w:szCs w:val="24"/>
-                        </w:rPr>
-                        <m:t>q</m:t>
-                      </m:r>
-                    </m:e>
-                    <m:sub>
-                      <m:r>
-                        <w:rPr>
-                          <w:rFonts w:ascii="Cambria Math" w:eastAsiaTheme="minorEastAsia" w:hAnsi="Cambria Math"/>
-                          <w:sz w:val="24"/>
-                          <w:szCs w:val="24"/>
-                        </w:rPr>
-                        <m:t>0</m:t>
-                      </m:r>
-                    </m:sub>
-                  </m:sSub>
-                  <m:r>
-                    <w:rPr>
-                      <w:rFonts w:ascii="Cambria Math" w:eastAsiaTheme="minorEastAsia" w:hAnsi="Cambria Math"/>
-                      <w:sz w:val="24"/>
-                      <w:szCs w:val="24"/>
-                    </w:rPr>
-                    <m:t>,</m:t>
-                  </m:r>
-                  <m:r>
-                    <w:rPr>
-                      <w:rFonts w:ascii="Cambria Math" w:eastAsiaTheme="minorEastAsia" w:hAnsi="Cambria Math"/>
-                      <w:sz w:val="24"/>
-                      <w:szCs w:val="24"/>
-                    </w:rPr>
-                    <m:t>BB</m:t>
-                  </m:r>
-                </m:e>
-              </m:d>
-            </m:e>
-          </m:d>
-        </m:oMath>
-      </m:oMathPara>
-    </w:p>
-    <w:p>
-      <w:pPr>
-        <w:spacing w:after="0"/>
-        <w:ind w:left="1440"/>
-        <w:rPr>
-          <w:rFonts w:eastAsiaTheme="minorEastAsia"/>
-          <w:sz w:val="24"/>
-          <w:szCs w:val="24"/>
-        </w:rPr>
-      </w:pPr>
-      <m:oMathPara>
-        <m:oMathParaPr>
-          <m:jc m:val="left"/>
-        </m:oMathParaPr>
-        <m:oMath>
-          <m:r>
-            <w:rPr>
-              <w:rFonts w:ascii="Cambria Math" w:eastAsiaTheme="minorEastAsia" w:hAnsi="Cambria Math"/>
-              <w:sz w:val="24"/>
-              <w:szCs w:val="24"/>
-            </w:rPr>
-            <m:t>δ</m:t>
-          </m:r>
-          <m:d>
-            <m:dPr>
-              <m:ctrlPr>
-                <w:rPr>
-                  <w:rFonts w:ascii="Cambria Math" w:eastAsiaTheme="minorEastAsia" w:hAnsi="Cambria Math"/>
-                  <w:i/>
-                  <w:sz w:val="24"/>
-                  <w:szCs w:val="24"/>
-                </w:rPr>
-              </m:ctrlPr>
-            </m:dPr>
-            <m:e>
-              <m:sSub>
-                <m:sSubPr>
-                  <m:ctrlPr>
-                    <w:rPr>
-                      <w:rFonts w:ascii="Cambria Math" w:eastAsiaTheme="minorEastAsia" w:hAnsi="Cambria Math"/>
-                      <w:i/>
-                      <w:sz w:val="24"/>
-                      <w:szCs w:val="24"/>
-                    </w:rPr>
-                  </m:ctrlPr>
-                </m:sSubPr>
-                <m:e>
-                  <m:r>
-                    <w:rPr>
-                      <w:rFonts w:ascii="Cambria Math" w:eastAsiaTheme="minorEastAsia" w:hAnsi="Cambria Math"/>
-                      <w:sz w:val="24"/>
-                      <w:szCs w:val="24"/>
-                    </w:rPr>
-                    <m:t>q</m:t>
-                  </m:r>
-                </m:e>
-                <m:sub>
-                  <m:r>
-                    <w:rPr>
-                      <w:rFonts w:ascii="Cambria Math" w:eastAsiaTheme="minorEastAsia" w:hAnsi="Cambria Math"/>
-                      <w:sz w:val="24"/>
-                      <w:szCs w:val="24"/>
-                    </w:rPr>
-                    <m:t>0</m:t>
-                  </m:r>
-                </m:sub>
-              </m:sSub>
-              <m:r>
-                <w:rPr>
-                  <w:rFonts w:ascii="Cambria Math" w:eastAsiaTheme="minorEastAsia" w:hAnsi="Cambria Math"/>
-                  <w:sz w:val="24"/>
-                  <w:szCs w:val="24"/>
-                </w:rPr>
-                <m:t>,</m:t>
-              </m:r>
-              <m:r>
-                <w:rPr>
-                  <w:rFonts w:ascii="Cambria Math" w:eastAsiaTheme="minorEastAsia" w:hAnsi="Cambria Math"/>
-                  <w:sz w:val="24"/>
-                  <w:szCs w:val="24"/>
-                </w:rPr>
-                <m:t>c</m:t>
-              </m:r>
-              <m:r>
-                <w:rPr>
-                  <w:rFonts w:ascii="Cambria Math" w:eastAsiaTheme="minorEastAsia" w:hAnsi="Cambria Math"/>
-                  <w:sz w:val="24"/>
-                  <w:szCs w:val="24"/>
-                </w:rPr>
-                <m:t>,Z</m:t>
-              </m:r>
-            </m:e>
-          </m:d>
-          <m:r>
-            <w:rPr>
-              <w:rFonts w:ascii="Cambria Math" w:eastAsiaTheme="minorEastAsia" w:hAnsi="Cambria Math"/>
-              <w:sz w:val="24"/>
-              <w:szCs w:val="24"/>
-            </w:rPr>
-            <m:t>=</m:t>
-          </m:r>
-          <m:d>
-            <m:dPr>
-              <m:begChr m:val="{"/>
-              <m:endChr m:val="}"/>
-              <m:ctrlPr>
-                <w:rPr>
-                  <w:rFonts w:ascii="Cambria Math" w:eastAsiaTheme="minorEastAsia" w:hAnsi="Cambria Math"/>
-                  <w:i/>
-                  <w:sz w:val="24"/>
-                  <w:szCs w:val="24"/>
-                </w:rPr>
-              </m:ctrlPr>
-            </m:dPr>
-            <m:e>
-              <m:d>
-                <m:dPr>
-                  <m:ctrlPr>
-                    <w:rPr>
-                      <w:rFonts w:ascii="Cambria Math" w:eastAsiaTheme="minorEastAsia" w:hAnsi="Cambria Math"/>
-                      <w:i/>
-                      <w:sz w:val="24"/>
-                      <w:szCs w:val="24"/>
-                    </w:rPr>
-                  </m:ctrlPr>
-                </m:dPr>
-                <m:e>
-                  <m:sSub>
-                    <m:sSubPr>
-                      <m:ctrlPr>
-                        <w:rPr>
-                          <w:rFonts w:ascii="Cambria Math" w:eastAsiaTheme="minorEastAsia" w:hAnsi="Cambria Math"/>
-                          <w:i/>
-                          <w:sz w:val="24"/>
-                          <w:szCs w:val="24"/>
-                        </w:rPr>
-                      </m:ctrlPr>
-                    </m:sSubPr>
-                    <m:e>
-                      <m:r>
-                        <w:rPr>
-                          <w:rFonts w:ascii="Cambria Math" w:eastAsiaTheme="minorEastAsia" w:hAnsi="Cambria Math"/>
-                          <w:sz w:val="24"/>
-                          <w:szCs w:val="24"/>
-                        </w:rPr>
-                        <m:t>q</m:t>
-                      </m:r>
-                    </m:e>
-                    <m:sub>
-                      <m:r>
-                        <w:rPr>
-                          <w:rFonts w:ascii="Cambria Math" w:eastAsiaTheme="minorEastAsia" w:hAnsi="Cambria Math"/>
-                          <w:sz w:val="24"/>
-                          <w:szCs w:val="24"/>
-                        </w:rPr>
-                        <m:t>0</m:t>
-                      </m:r>
-                    </m:sub>
-                  </m:sSub>
-                  <m:r>
-                    <w:rPr>
-                      <w:rFonts w:ascii="Cambria Math" w:eastAsiaTheme="minorEastAsia" w:hAnsi="Cambria Math"/>
-                      <w:sz w:val="24"/>
-                      <w:szCs w:val="24"/>
-                    </w:rPr>
-                    <m:t>,Z</m:t>
-                  </m:r>
-                </m:e>
-              </m:d>
-            </m:e>
-          </m:d>
-        </m:oMath>
-      </m:oMathPara>
-    </w:p>
-    <w:p>
-      <w:pPr>
-        <w:spacing w:after="0"/>
-        <w:ind w:left="1440"/>
-        <w:rPr>
-          <w:rFonts w:eastAsiaTheme="minorEastAsia"/>
-          <w:sz w:val="24"/>
-          <w:szCs w:val="24"/>
-        </w:rPr>
-      </w:pPr>
-      <m:oMathPara>
-        <m:oMathParaPr>
-          <m:jc m:val="left"/>
-        </m:oMathParaPr>
-        <m:oMath>
-          <m:r>
-            <w:rPr>
-              <w:rFonts w:ascii="Cambria Math" w:eastAsiaTheme="minorEastAsia" w:hAnsi="Cambria Math"/>
-              <w:sz w:val="24"/>
-              <w:szCs w:val="24"/>
-            </w:rPr>
-            <m:t>δ</m:t>
-          </m:r>
-          <m:d>
-            <m:dPr>
-              <m:ctrlPr>
-                <w:rPr>
-                  <w:rFonts w:ascii="Cambria Math" w:eastAsiaTheme="minorEastAsia" w:hAnsi="Cambria Math"/>
-                  <w:i/>
-                  <w:sz w:val="24"/>
-                  <w:szCs w:val="24"/>
-                </w:rPr>
-              </m:ctrlPr>
-            </m:dPr>
-            <m:e>
-              <m:sSub>
-                <m:sSubPr>
-                  <m:ctrlPr>
-                    <w:rPr>
-                      <w:rFonts w:ascii="Cambria Math" w:eastAsiaTheme="minorEastAsia" w:hAnsi="Cambria Math"/>
-                      <w:i/>
-                      <w:sz w:val="24"/>
-                      <w:szCs w:val="24"/>
-                    </w:rPr>
-                  </m:ctrlPr>
-                </m:sSubPr>
-                <m:e>
-                  <m:r>
-                    <w:rPr>
-                      <w:rFonts w:ascii="Cambria Math" w:eastAsiaTheme="minorEastAsia" w:hAnsi="Cambria Math"/>
-                      <w:sz w:val="24"/>
-                      <w:szCs w:val="24"/>
-                    </w:rPr>
-                    <m:t>q</m:t>
-                  </m:r>
-                </m:e>
-                <m:sub>
-                  <m:r>
-                    <w:rPr>
-                      <w:rFonts w:ascii="Cambria Math" w:eastAsiaTheme="minorEastAsia" w:hAnsi="Cambria Math"/>
-                      <w:sz w:val="24"/>
-                      <w:szCs w:val="24"/>
-                    </w:rPr>
-                    <m:t>0</m:t>
-                  </m:r>
-                </m:sub>
-              </m:sSub>
-              <m:r>
-                <w:rPr>
-                  <w:rFonts w:ascii="Cambria Math" w:eastAsiaTheme="minorEastAsia" w:hAnsi="Cambria Math"/>
-                  <w:sz w:val="24"/>
-                  <w:szCs w:val="24"/>
-                </w:rPr>
-                <m:t>,</m:t>
-              </m:r>
-              <m:r>
-                <w:rPr>
-                  <w:rFonts w:ascii="Cambria Math" w:eastAsiaTheme="minorEastAsia" w:hAnsi="Cambria Math"/>
-                  <w:sz w:val="24"/>
-                  <w:szCs w:val="24"/>
-                </w:rPr>
-                <m:t>c</m:t>
-              </m:r>
-              <m:r>
-                <w:rPr>
-                  <w:rFonts w:ascii="Cambria Math" w:eastAsiaTheme="minorEastAsia" w:hAnsi="Cambria Math"/>
-                  <w:sz w:val="24"/>
-                  <w:szCs w:val="24"/>
-                </w:rPr>
-                <m:t>,O</m:t>
-              </m:r>
-            </m:e>
-          </m:d>
-          <m:r>
-            <w:rPr>
-              <w:rFonts w:ascii="Cambria Math" w:eastAsiaTheme="minorEastAsia" w:hAnsi="Cambria Math"/>
-              <w:sz w:val="24"/>
-              <w:szCs w:val="24"/>
-            </w:rPr>
-            <m:t>=</m:t>
-          </m:r>
-          <m:d>
-            <m:dPr>
-              <m:begChr m:val="{"/>
-              <m:endChr m:val="}"/>
-              <m:ctrlPr>
-                <w:rPr>
-                  <w:rFonts w:ascii="Cambria Math" w:eastAsiaTheme="minorEastAsia" w:hAnsi="Cambria Math"/>
-                  <w:i/>
-                  <w:sz w:val="24"/>
-                  <w:szCs w:val="24"/>
-                </w:rPr>
-              </m:ctrlPr>
-            </m:dPr>
-            <m:e>
-              <m:d>
-                <m:dPr>
-                  <m:ctrlPr>
-                    <w:rPr>
-                      <w:rFonts w:ascii="Cambria Math" w:eastAsiaTheme="minorEastAsia" w:hAnsi="Cambria Math"/>
-                      <w:i/>
-                      <w:sz w:val="24"/>
-                      <w:szCs w:val="24"/>
-                    </w:rPr>
-                  </m:ctrlPr>
-                </m:dPr>
-                <m:e>
-                  <m:sSub>
-                    <m:sSubPr>
-                      <m:ctrlPr>
-                        <w:rPr>
-                          <w:rFonts w:ascii="Cambria Math" w:eastAsiaTheme="minorEastAsia" w:hAnsi="Cambria Math"/>
-                          <w:i/>
-                          <w:sz w:val="24"/>
-                          <w:szCs w:val="24"/>
-                        </w:rPr>
-                      </m:ctrlPr>
-                    </m:sSubPr>
-                    <m:e>
-                      <m:r>
-                        <w:rPr>
-                          <w:rFonts w:ascii="Cambria Math" w:eastAsiaTheme="minorEastAsia" w:hAnsi="Cambria Math"/>
-                          <w:sz w:val="24"/>
-                          <w:szCs w:val="24"/>
-                        </w:rPr>
-                        <m:t>q</m:t>
-                      </m:r>
-                    </m:e>
-                    <m:sub>
-                      <m:r>
-                        <w:rPr>
-                          <w:rFonts w:ascii="Cambria Math" w:eastAsiaTheme="minorEastAsia" w:hAnsi="Cambria Math"/>
-                          <w:sz w:val="24"/>
-                          <w:szCs w:val="24"/>
-                        </w:rPr>
-                        <m:t>0</m:t>
-                      </m:r>
-                    </m:sub>
-                  </m:sSub>
-                  <m:r>
-                    <w:rPr>
-                      <w:rFonts w:ascii="Cambria Math" w:eastAsiaTheme="minorEastAsia" w:hAnsi="Cambria Math"/>
-                      <w:sz w:val="24"/>
-                      <w:szCs w:val="24"/>
-                    </w:rPr>
-                    <m:t>,</m:t>
-                  </m:r>
-                  <m:r>
-                    <w:rPr>
-                      <w:rFonts w:ascii="Cambria Math" w:eastAsiaTheme="minorEastAsia" w:hAnsi="Cambria Math"/>
-                      <w:sz w:val="24"/>
-                      <w:szCs w:val="24"/>
-                    </w:rPr>
-                    <m:t>O</m:t>
-                  </m:r>
-                </m:e>
-              </m:d>
-            </m:e>
-          </m:d>
-        </m:oMath>
-      </m:oMathPara>
-    </w:p>
-    <w:p>
-      <w:pPr>
-        <w:spacing w:after="0"/>
-        <w:ind w:left="1440"/>
-        <w:rPr>
-          <w:rFonts w:eastAsiaTheme="minorEastAsia"/>
-          <w:sz w:val="24"/>
-          <w:szCs w:val="24"/>
-        </w:rPr>
-      </w:pPr>
-      <m:oMathPara>
-        <m:oMathParaPr>
-          <m:jc m:val="left"/>
-        </m:oMathParaPr>
-        <m:oMath>
-          <m:r>
-            <w:rPr>
-              <w:rFonts w:ascii="Cambria Math" w:eastAsiaTheme="minorEastAsia" w:hAnsi="Cambria Math"/>
-              <w:sz w:val="24"/>
-              <w:szCs w:val="24"/>
-            </w:rPr>
-            <m:t>δ</m:t>
-          </m:r>
-          <m:d>
-            <m:dPr>
-              <m:ctrlPr>
-                <w:rPr>
-                  <w:rFonts w:ascii="Cambria Math" w:eastAsiaTheme="minorEastAsia" w:hAnsi="Cambria Math"/>
-                  <w:i/>
-                  <w:sz w:val="24"/>
-                  <w:szCs w:val="24"/>
-                </w:rPr>
-              </m:ctrlPr>
-            </m:dPr>
-            <m:e>
-              <m:sSub>
-                <m:sSubPr>
-                  <m:ctrlPr>
-                    <w:rPr>
-                      <w:rFonts w:ascii="Cambria Math" w:eastAsiaTheme="minorEastAsia" w:hAnsi="Cambria Math"/>
-                      <w:i/>
-                      <w:sz w:val="24"/>
-                      <w:szCs w:val="24"/>
-                    </w:rPr>
-                  </m:ctrlPr>
-                </m:sSubPr>
-                <m:e>
-                  <m:r>
-                    <w:rPr>
-                      <w:rFonts w:ascii="Cambria Math" w:eastAsiaTheme="minorEastAsia" w:hAnsi="Cambria Math"/>
-                      <w:sz w:val="24"/>
-                      <w:szCs w:val="24"/>
-                    </w:rPr>
-                    <m:t>q</m:t>
-                  </m:r>
-                </m:e>
-                <m:sub>
-                  <m:r>
-                    <w:rPr>
-                      <w:rFonts w:ascii="Cambria Math" w:eastAsiaTheme="minorEastAsia" w:hAnsi="Cambria Math"/>
-                      <w:sz w:val="24"/>
-                      <w:szCs w:val="24"/>
-                    </w:rPr>
-                    <m:t>0</m:t>
-                  </m:r>
-                </m:sub>
-              </m:sSub>
-              <m:r>
-                <w:rPr>
-                  <w:rFonts w:ascii="Cambria Math" w:eastAsiaTheme="minorEastAsia" w:hAnsi="Cambria Math"/>
-                  <w:sz w:val="24"/>
-                  <w:szCs w:val="24"/>
-                </w:rPr>
-                <m:t>,</m:t>
-              </m:r>
-              <m:r>
-                <w:rPr>
-                  <w:rFonts w:ascii="Cambria Math" w:eastAsiaTheme="minorEastAsia" w:hAnsi="Cambria Math"/>
-                  <w:sz w:val="24"/>
-                  <w:szCs w:val="24"/>
-                </w:rPr>
-                <m:t>c</m:t>
-              </m:r>
-              <m:r>
-                <w:rPr>
-                  <w:rFonts w:ascii="Cambria Math" w:eastAsiaTheme="minorEastAsia" w:hAnsi="Cambria Math"/>
-                  <w:sz w:val="24"/>
-                  <w:szCs w:val="24"/>
-                </w:rPr>
-                <m:t>,A</m:t>
-              </m:r>
-            </m:e>
-          </m:d>
-          <m:r>
-            <w:rPr>
-              <w:rFonts w:ascii="Cambria Math" w:eastAsiaTheme="minorEastAsia" w:hAnsi="Cambria Math"/>
-              <w:sz w:val="24"/>
-              <w:szCs w:val="24"/>
-            </w:rPr>
-            <m:t>=</m:t>
-          </m:r>
-          <m:d>
-            <m:dPr>
-              <m:begChr m:val="{"/>
-              <m:endChr m:val="}"/>
-              <m:ctrlPr>
-                <w:rPr>
-                  <w:rFonts w:ascii="Cambria Math" w:eastAsiaTheme="minorEastAsia" w:hAnsi="Cambria Math"/>
-                  <w:i/>
-                  <w:sz w:val="24"/>
-                  <w:szCs w:val="24"/>
-                </w:rPr>
-              </m:ctrlPr>
-            </m:dPr>
-            <m:e>
-              <m:d>
-                <m:dPr>
-                  <m:ctrlPr>
-                    <w:rPr>
-                      <w:rFonts w:ascii="Cambria Math" w:eastAsiaTheme="minorEastAsia" w:hAnsi="Cambria Math"/>
-                      <w:i/>
-                      <w:sz w:val="24"/>
-                      <w:szCs w:val="24"/>
-                    </w:rPr>
-                  </m:ctrlPr>
-                </m:dPr>
-                <m:e>
-                  <m:sSub>
-                    <m:sSubPr>
-                      <m:ctrlPr>
-                        <w:rPr>
-                          <w:rFonts w:ascii="Cambria Math" w:eastAsiaTheme="minorEastAsia" w:hAnsi="Cambria Math"/>
-                          <w:i/>
-                          <w:sz w:val="24"/>
-                          <w:szCs w:val="24"/>
-                        </w:rPr>
-                      </m:ctrlPr>
-                    </m:sSubPr>
-                    <m:e>
-                      <m:r>
-                        <w:rPr>
-                          <w:rFonts w:ascii="Cambria Math" w:eastAsiaTheme="minorEastAsia" w:hAnsi="Cambria Math"/>
-                          <w:sz w:val="24"/>
-                          <w:szCs w:val="24"/>
-                        </w:rPr>
-                        <m:t>q</m:t>
-                      </m:r>
-                    </m:e>
-                    <m:sub>
-                      <m:r>
-                        <w:rPr>
-                          <w:rFonts w:ascii="Cambria Math" w:eastAsiaTheme="minorEastAsia" w:hAnsi="Cambria Math"/>
-                          <w:sz w:val="24"/>
-                          <w:szCs w:val="24"/>
-                        </w:rPr>
-                        <m:t>0</m:t>
-                      </m:r>
-                    </m:sub>
-                  </m:sSub>
-                  <m:r>
-                    <w:rPr>
-                      <w:rFonts w:ascii="Cambria Math" w:eastAsiaTheme="minorEastAsia" w:hAnsi="Cambria Math"/>
-                      <w:sz w:val="24"/>
-                      <w:szCs w:val="24"/>
-                    </w:rPr>
-                    <m:t>,</m:t>
-                  </m:r>
-                  <m:r>
-                    <w:rPr>
-                      <w:rFonts w:ascii="Cambria Math" w:eastAsiaTheme="minorEastAsia" w:hAnsi="Cambria Math"/>
-                      <w:sz w:val="24"/>
-                      <w:szCs w:val="24"/>
-                    </w:rPr>
-                    <m:t>A</m:t>
-                  </m:r>
-                </m:e>
-              </m:d>
-            </m:e>
-          </m:d>
-        </m:oMath>
-      </m:oMathPara>
-    </w:p>
-    <w:p>
-      <w:pPr>
-        <w:spacing w:after="0"/>
-        <w:ind w:left="1440"/>
-        <w:rPr>
-          <w:rFonts w:eastAsiaTheme="minorEastAsia"/>
-          <w:sz w:val="24"/>
-          <w:szCs w:val="24"/>
-        </w:rPr>
-      </w:pPr>
-      <m:oMathPara>
-        <m:oMathParaPr>
-          <m:jc m:val="left"/>
-        </m:oMathParaPr>
-        <m:oMath>
-          <m:r>
-            <w:rPr>
-              <w:rFonts w:ascii="Cambria Math" w:eastAsiaTheme="minorEastAsia" w:hAnsi="Cambria Math"/>
-              <w:sz w:val="24"/>
-              <w:szCs w:val="24"/>
-            </w:rPr>
-            <m:t>δ</m:t>
-          </m:r>
-          <m:d>
-            <m:dPr>
-              <m:ctrlPr>
-                <w:rPr>
-                  <w:rFonts w:ascii="Cambria Math" w:eastAsiaTheme="minorEastAsia" w:hAnsi="Cambria Math"/>
-                  <w:i/>
-                  <w:sz w:val="24"/>
-                  <w:szCs w:val="24"/>
-                </w:rPr>
-              </m:ctrlPr>
-            </m:dPr>
-            <m:e>
-              <m:sSub>
-                <m:sSubPr>
-                  <m:ctrlPr>
-                    <w:rPr>
-                      <w:rFonts w:ascii="Cambria Math" w:eastAsiaTheme="minorEastAsia" w:hAnsi="Cambria Math"/>
-                      <w:i/>
-                      <w:sz w:val="24"/>
-                      <w:szCs w:val="24"/>
-                    </w:rPr>
-                  </m:ctrlPr>
-                </m:sSubPr>
-                <m:e>
-                  <m:r>
-                    <w:rPr>
-                      <w:rFonts w:ascii="Cambria Math" w:eastAsiaTheme="minorEastAsia" w:hAnsi="Cambria Math"/>
-                      <w:sz w:val="24"/>
-                      <w:szCs w:val="24"/>
-                    </w:rPr>
-                    <m:t>q</m:t>
-                  </m:r>
-                </m:e>
-                <m:sub>
-                  <m:r>
-                    <w:rPr>
-                      <w:rFonts w:ascii="Cambria Math" w:eastAsiaTheme="minorEastAsia" w:hAnsi="Cambria Math"/>
-                      <w:sz w:val="24"/>
-                      <w:szCs w:val="24"/>
-                    </w:rPr>
-                    <m:t>0</m:t>
-                  </m:r>
-                </m:sub>
-              </m:sSub>
-              <m:r>
-                <w:rPr>
-                  <w:rFonts w:ascii="Cambria Math" w:eastAsiaTheme="minorEastAsia" w:hAnsi="Cambria Math"/>
-                  <w:sz w:val="24"/>
-                  <w:szCs w:val="24"/>
-                </w:rPr>
-                <m:t>,</m:t>
-              </m:r>
-              <m:r>
-                <w:rPr>
-                  <w:rFonts w:ascii="Cambria Math" w:eastAsiaTheme="minorEastAsia" w:hAnsi="Cambria Math"/>
-                  <w:sz w:val="24"/>
-                  <w:szCs w:val="24"/>
-                </w:rPr>
-                <m:t>c</m:t>
-              </m:r>
-              <m:r>
-                <w:rPr>
-                  <w:rFonts w:ascii="Cambria Math" w:eastAsiaTheme="minorEastAsia" w:hAnsi="Cambria Math"/>
-                  <w:sz w:val="24"/>
-                  <w:szCs w:val="24"/>
-                </w:rPr>
-                <m:t>,B</m:t>
-              </m:r>
-            </m:e>
-          </m:d>
-          <m:r>
-            <w:rPr>
-              <w:rFonts w:ascii="Cambria Math" w:eastAsiaTheme="minorEastAsia" w:hAnsi="Cambria Math"/>
-              <w:sz w:val="24"/>
-              <w:szCs w:val="24"/>
-            </w:rPr>
-            <m:t>=</m:t>
-          </m:r>
-          <m:d>
-            <m:dPr>
-              <m:begChr m:val="{"/>
-              <m:endChr m:val="}"/>
-              <m:ctrlPr>
-                <w:rPr>
-                  <w:rFonts w:ascii="Cambria Math" w:eastAsiaTheme="minorEastAsia" w:hAnsi="Cambria Math"/>
-                  <w:i/>
-                  <w:sz w:val="24"/>
-                  <w:szCs w:val="24"/>
-                </w:rPr>
-              </m:ctrlPr>
-            </m:dPr>
-            <m:e>
-              <m:d>
-                <m:dPr>
-                  <m:ctrlPr>
-                    <w:rPr>
-                      <w:rFonts w:ascii="Cambria Math" w:eastAsiaTheme="minorEastAsia" w:hAnsi="Cambria Math"/>
-                      <w:i/>
-                      <w:sz w:val="24"/>
-                      <w:szCs w:val="24"/>
-                    </w:rPr>
-                  </m:ctrlPr>
-                </m:dPr>
-                <m:e>
-                  <m:sSub>
-                    <m:sSubPr>
-                      <m:ctrlPr>
-                        <w:rPr>
-                          <w:rFonts w:ascii="Cambria Math" w:eastAsiaTheme="minorEastAsia" w:hAnsi="Cambria Math"/>
-                          <w:i/>
-                          <w:sz w:val="24"/>
-                          <w:szCs w:val="24"/>
-                        </w:rPr>
-                      </m:ctrlPr>
-                    </m:sSubPr>
-                    <m:e>
-                      <m:r>
-                        <w:rPr>
-                          <w:rFonts w:ascii="Cambria Math" w:eastAsiaTheme="minorEastAsia" w:hAnsi="Cambria Math"/>
-                          <w:sz w:val="24"/>
-                          <w:szCs w:val="24"/>
-                        </w:rPr>
-                        <m:t>q</m:t>
-                      </m:r>
-                    </m:e>
-                    <m:sub>
-                      <m:r>
-                        <w:rPr>
-                          <w:rFonts w:ascii="Cambria Math" w:eastAsiaTheme="minorEastAsia" w:hAnsi="Cambria Math"/>
-                          <w:sz w:val="24"/>
-                          <w:szCs w:val="24"/>
-                        </w:rPr>
-                        <m:t>0</m:t>
-                      </m:r>
-                    </m:sub>
-                  </m:sSub>
-                  <m:r>
-                    <w:rPr>
-                      <w:rFonts w:ascii="Cambria Math" w:eastAsiaTheme="minorEastAsia" w:hAnsi="Cambria Math"/>
-                      <w:sz w:val="24"/>
-                      <w:szCs w:val="24"/>
-                    </w:rPr>
-                    <m:t>,B</m:t>
-                  </m:r>
-                </m:e>
-              </m:d>
-            </m:e>
-          </m:d>
-        </m:oMath>
-      </m:oMathPara>
-    </w:p>
-    <w:p>
-      <w:pPr>
-        <w:spacing w:after="0"/>
-        <w:ind w:left="1440"/>
-        <w:rPr>
-          <w:rFonts w:eastAsiaTheme="minorEastAsia"/>
-          <w:sz w:val="24"/>
-          <w:szCs w:val="24"/>
-        </w:rPr>
-      </w:pPr>
-      <m:oMathPara>
-        <m:oMathParaPr>
-          <m:jc m:val="left"/>
-        </m:oMathParaPr>
-        <m:oMath>
-          <m:r>
-            <w:rPr>
-              <w:rFonts w:ascii="Cambria Math" w:eastAsiaTheme="minorEastAsia" w:hAnsi="Cambria Math"/>
-              <w:sz w:val="24"/>
-              <w:szCs w:val="24"/>
-            </w:rPr>
-            <m:t>δ</m:t>
-          </m:r>
-          <m:d>
-            <m:dPr>
-              <m:ctrlPr>
-                <w:rPr>
-                  <w:rFonts w:ascii="Cambria Math" w:eastAsiaTheme="minorEastAsia" w:hAnsi="Cambria Math"/>
-                  <w:i/>
-                  <w:sz w:val="24"/>
-                  <w:szCs w:val="24"/>
-                </w:rPr>
-              </m:ctrlPr>
-            </m:dPr>
-            <m:e>
-              <m:sSub>
-                <m:sSubPr>
-                  <m:ctrlPr>
-                    <w:rPr>
-                      <w:rFonts w:ascii="Cambria Math" w:eastAsiaTheme="minorEastAsia" w:hAnsi="Cambria Math"/>
-                      <w:i/>
-                      <w:sz w:val="24"/>
-                      <w:szCs w:val="24"/>
-                    </w:rPr>
-                  </m:ctrlPr>
-                </m:sSubPr>
-                <m:e>
-                  <m:r>
-                    <w:rPr>
-                      <w:rFonts w:ascii="Cambria Math" w:eastAsiaTheme="minorEastAsia" w:hAnsi="Cambria Math"/>
-                      <w:sz w:val="24"/>
-                      <w:szCs w:val="24"/>
-                    </w:rPr>
-                    <m:t>q</m:t>
-                  </m:r>
-                </m:e>
-                <m:sub>
-                  <m:r>
-                    <w:rPr>
-                      <w:rFonts w:ascii="Cambria Math" w:eastAsiaTheme="minorEastAsia" w:hAnsi="Cambria Math"/>
-                      <w:sz w:val="24"/>
-                      <w:szCs w:val="24"/>
-                    </w:rPr>
-                    <m:t>0</m:t>
-                  </m:r>
-                </m:sub>
-              </m:sSub>
-              <m:r>
-                <w:rPr>
-                  <w:rFonts w:ascii="Cambria Math" w:eastAsiaTheme="minorEastAsia" w:hAnsi="Cambria Math"/>
-                  <w:sz w:val="24"/>
-                  <w:szCs w:val="24"/>
-                </w:rPr>
-                <m:t>,</m:t>
-              </m:r>
-              <m:r>
-                <w:rPr>
-                  <w:rFonts w:ascii="Cambria Math" w:eastAsiaTheme="minorEastAsia" w:hAnsi="Cambria Math"/>
-                  <w:sz w:val="24"/>
-                  <w:szCs w:val="24"/>
-                </w:rPr>
-                <m:t>λ</m:t>
-              </m:r>
-              <m:r>
-                <w:rPr>
-                  <w:rFonts w:ascii="Cambria Math" w:eastAsiaTheme="minorEastAsia" w:hAnsi="Cambria Math"/>
-                  <w:sz w:val="24"/>
-                  <w:szCs w:val="24"/>
-                </w:rPr>
-                <m:t>,</m:t>
-              </m:r>
-              <m:r>
-                <w:rPr>
-                  <w:rFonts w:ascii="Cambria Math" w:eastAsiaTheme="minorEastAsia" w:hAnsi="Cambria Math"/>
-                  <w:sz w:val="24"/>
-                  <w:szCs w:val="24"/>
-                </w:rPr>
-                <m:t>O</m:t>
+                <m:t>,λ,Z</m:t>
               </m:r>
             </m:e>
           </m:d>
@@ -3057,6 +961,884 @@
                       <w:sz w:val="24"/>
                       <w:szCs w:val="24"/>
                     </w:rPr>
+                    <m:t>,B</m:t>
+                  </m:r>
+                </m:e>
+              </m:d>
+            </m:e>
+          </m:d>
+        </m:oMath>
+      </m:oMathPara>
+    </w:p>
+    <w:p>
+      <w:pPr>
+        <w:spacing w:after="0"/>
+        <w:ind w:left="1440"/>
+        <w:rPr>
+          <w:rFonts w:eastAsiaTheme="minorEastAsia"/>
+          <w:sz w:val="24"/>
+          <w:szCs w:val="24"/>
+        </w:rPr>
+      </w:pPr>
+      <m:oMathPara>
+        <m:oMathParaPr>
+          <m:jc m:val="left"/>
+        </m:oMathParaPr>
+        <m:oMath>
+          <m:r>
+            <w:rPr>
+              <w:rFonts w:ascii="Cambria Math" w:eastAsiaTheme="minorEastAsia" w:hAnsi="Cambria Math"/>
+              <w:sz w:val="24"/>
+              <w:szCs w:val="24"/>
+            </w:rPr>
+            <m:t>δ</m:t>
+          </m:r>
+          <m:d>
+            <m:dPr>
+              <m:ctrlPr>
+                <w:rPr>
+                  <w:rFonts w:ascii="Cambria Math" w:eastAsiaTheme="minorEastAsia" w:hAnsi="Cambria Math"/>
+                  <w:i/>
+                  <w:sz w:val="24"/>
+                  <w:szCs w:val="24"/>
+                </w:rPr>
+              </m:ctrlPr>
+            </m:dPr>
+            <m:e>
+              <m:sSub>
+                <m:sSubPr>
+                  <m:ctrlPr>
+                    <w:rPr>
+                      <w:rFonts w:ascii="Cambria Math" w:eastAsiaTheme="minorEastAsia" w:hAnsi="Cambria Math"/>
+                      <w:i/>
+                      <w:sz w:val="24"/>
+                      <w:szCs w:val="24"/>
+                    </w:rPr>
+                  </m:ctrlPr>
+                </m:sSubPr>
+                <m:e>
+                  <m:r>
+                    <w:rPr>
+                      <w:rFonts w:ascii="Cambria Math" w:eastAsiaTheme="minorEastAsia" w:hAnsi="Cambria Math"/>
+                      <w:sz w:val="24"/>
+                      <w:szCs w:val="24"/>
+                    </w:rPr>
+                    <m:t>q</m:t>
+                  </m:r>
+                </m:e>
+                <m:sub>
+                  <m:r>
+                    <w:rPr>
+                      <w:rFonts w:ascii="Cambria Math" w:eastAsiaTheme="minorEastAsia" w:hAnsi="Cambria Math"/>
+                      <w:sz w:val="24"/>
+                      <w:szCs w:val="24"/>
+                    </w:rPr>
+                    <m:t>1</m:t>
+                  </m:r>
+                </m:sub>
+              </m:sSub>
+              <m:r>
+                <w:rPr>
+                  <w:rFonts w:ascii="Cambria Math" w:eastAsiaTheme="minorEastAsia" w:hAnsi="Cambria Math"/>
+                  <w:sz w:val="24"/>
+                  <w:szCs w:val="24"/>
+                </w:rPr>
+                <m:t>,a,Z</m:t>
+              </m:r>
+            </m:e>
+          </m:d>
+          <m:r>
+            <w:rPr>
+              <w:rFonts w:ascii="Cambria Math" w:eastAsiaTheme="minorEastAsia" w:hAnsi="Cambria Math"/>
+              <w:sz w:val="24"/>
+              <w:szCs w:val="24"/>
+            </w:rPr>
+            <m:t>=</m:t>
+          </m:r>
+          <m:d>
+            <m:dPr>
+              <m:begChr m:val="{"/>
+              <m:endChr m:val="}"/>
+              <m:ctrlPr>
+                <w:rPr>
+                  <w:rFonts w:ascii="Cambria Math" w:eastAsiaTheme="minorEastAsia" w:hAnsi="Cambria Math"/>
+                  <w:i/>
+                  <w:sz w:val="24"/>
+                  <w:szCs w:val="24"/>
+                </w:rPr>
+              </m:ctrlPr>
+            </m:dPr>
+            <m:e>
+              <m:d>
+                <m:dPr>
+                  <m:ctrlPr>
+                    <w:rPr>
+                      <w:rFonts w:ascii="Cambria Math" w:eastAsiaTheme="minorEastAsia" w:hAnsi="Cambria Math"/>
+                      <w:i/>
+                      <w:sz w:val="24"/>
+                      <w:szCs w:val="24"/>
+                    </w:rPr>
+                  </m:ctrlPr>
+                </m:dPr>
+                <m:e>
+                  <m:sSub>
+                    <m:sSubPr>
+                      <m:ctrlPr>
+                        <w:rPr>
+                          <w:rFonts w:ascii="Cambria Math" w:eastAsiaTheme="minorEastAsia" w:hAnsi="Cambria Math"/>
+                          <w:i/>
+                          <w:sz w:val="24"/>
+                          <w:szCs w:val="24"/>
+                        </w:rPr>
+                      </m:ctrlPr>
+                    </m:sSubPr>
+                    <m:e>
+                      <m:r>
+                        <w:rPr>
+                          <w:rFonts w:ascii="Cambria Math" w:eastAsiaTheme="minorEastAsia" w:hAnsi="Cambria Math"/>
+                          <w:sz w:val="24"/>
+                          <w:szCs w:val="24"/>
+                        </w:rPr>
+                        <m:t>q</m:t>
+                      </m:r>
+                    </m:e>
+                    <m:sub>
+                      <m:r>
+                        <w:rPr>
+                          <w:rFonts w:ascii="Cambria Math" w:eastAsiaTheme="minorEastAsia" w:hAnsi="Cambria Math"/>
+                          <w:sz w:val="24"/>
+                          <w:szCs w:val="24"/>
+                        </w:rPr>
+                        <m:t>1</m:t>
+                      </m:r>
+                    </m:sub>
+                  </m:sSub>
+                  <m:r>
+                    <w:rPr>
+                      <w:rFonts w:ascii="Cambria Math" w:eastAsiaTheme="minorEastAsia" w:hAnsi="Cambria Math"/>
+                      <w:sz w:val="24"/>
+                      <w:szCs w:val="24"/>
+                    </w:rPr>
+                    <m:t>,</m:t>
+                  </m:r>
+                  <m:r>
+                    <w:rPr>
+                      <w:rFonts w:ascii="Cambria Math" w:eastAsiaTheme="minorEastAsia" w:hAnsi="Cambria Math"/>
+                      <w:sz w:val="24"/>
+                      <w:szCs w:val="24"/>
+                    </w:rPr>
+                    <m:t>A</m:t>
+                  </m:r>
+                  <m:r>
+                    <w:rPr>
+                      <w:rFonts w:ascii="Cambria Math" w:eastAsiaTheme="minorEastAsia" w:hAnsi="Cambria Math"/>
+                      <w:sz w:val="24"/>
+                      <w:szCs w:val="24"/>
+                    </w:rPr>
+                    <m:t>Z</m:t>
+                  </m:r>
+                </m:e>
+              </m:d>
+            </m:e>
+          </m:d>
+        </m:oMath>
+      </m:oMathPara>
+    </w:p>
+    <w:p>
+      <w:pPr>
+        <w:spacing w:after="0"/>
+        <w:ind w:left="1440"/>
+        <w:rPr>
+          <w:rFonts w:eastAsiaTheme="minorEastAsia"/>
+          <w:sz w:val="24"/>
+          <w:szCs w:val="24"/>
+        </w:rPr>
+      </w:pPr>
+      <m:oMathPara>
+        <m:oMathParaPr>
+          <m:jc m:val="left"/>
+        </m:oMathParaPr>
+        <m:oMath>
+          <m:r>
+            <w:rPr>
+              <w:rFonts w:ascii="Cambria Math" w:eastAsiaTheme="minorEastAsia" w:hAnsi="Cambria Math"/>
+              <w:sz w:val="24"/>
+              <w:szCs w:val="24"/>
+            </w:rPr>
+            <m:t>δ</m:t>
+          </m:r>
+          <m:d>
+            <m:dPr>
+              <m:ctrlPr>
+                <w:rPr>
+                  <w:rFonts w:ascii="Cambria Math" w:eastAsiaTheme="minorEastAsia" w:hAnsi="Cambria Math"/>
+                  <w:i/>
+                  <w:sz w:val="24"/>
+                  <w:szCs w:val="24"/>
+                </w:rPr>
+              </m:ctrlPr>
+            </m:dPr>
+            <m:e>
+              <m:sSub>
+                <m:sSubPr>
+                  <m:ctrlPr>
+                    <w:rPr>
+                      <w:rFonts w:ascii="Cambria Math" w:eastAsiaTheme="minorEastAsia" w:hAnsi="Cambria Math"/>
+                      <w:i/>
+                      <w:sz w:val="24"/>
+                      <w:szCs w:val="24"/>
+                    </w:rPr>
+                  </m:ctrlPr>
+                </m:sSubPr>
+                <m:e>
+                  <m:r>
+                    <w:rPr>
+                      <w:rFonts w:ascii="Cambria Math" w:eastAsiaTheme="minorEastAsia" w:hAnsi="Cambria Math"/>
+                      <w:sz w:val="24"/>
+                      <w:szCs w:val="24"/>
+                    </w:rPr>
+                    <m:t>q</m:t>
+                  </m:r>
+                </m:e>
+                <m:sub>
+                  <m:r>
+                    <w:rPr>
+                      <w:rFonts w:ascii="Cambria Math" w:eastAsiaTheme="minorEastAsia" w:hAnsi="Cambria Math"/>
+                      <w:sz w:val="24"/>
+                      <w:szCs w:val="24"/>
+                    </w:rPr>
+                    <m:t>1</m:t>
+                  </m:r>
+                </m:sub>
+              </m:sSub>
+              <m:r>
+                <w:rPr>
+                  <w:rFonts w:ascii="Cambria Math" w:eastAsiaTheme="minorEastAsia" w:hAnsi="Cambria Math"/>
+                  <w:sz w:val="24"/>
+                  <w:szCs w:val="24"/>
+                </w:rPr>
+                <m:t>,a,</m:t>
+              </m:r>
+              <m:r>
+                <w:rPr>
+                  <w:rFonts w:ascii="Cambria Math" w:eastAsiaTheme="minorEastAsia" w:hAnsi="Cambria Math"/>
+                  <w:sz w:val="24"/>
+                  <w:szCs w:val="24"/>
+                </w:rPr>
+                <m:t>A</m:t>
+              </m:r>
+            </m:e>
+          </m:d>
+          <m:r>
+            <w:rPr>
+              <w:rFonts w:ascii="Cambria Math" w:eastAsiaTheme="minorEastAsia" w:hAnsi="Cambria Math"/>
+              <w:sz w:val="24"/>
+              <w:szCs w:val="24"/>
+            </w:rPr>
+            <m:t>=</m:t>
+          </m:r>
+          <m:d>
+            <m:dPr>
+              <m:begChr m:val="{"/>
+              <m:endChr m:val="}"/>
+              <m:ctrlPr>
+                <w:rPr>
+                  <w:rFonts w:ascii="Cambria Math" w:eastAsiaTheme="minorEastAsia" w:hAnsi="Cambria Math"/>
+                  <w:i/>
+                  <w:sz w:val="24"/>
+                  <w:szCs w:val="24"/>
+                </w:rPr>
+              </m:ctrlPr>
+            </m:dPr>
+            <m:e>
+              <m:d>
+                <m:dPr>
+                  <m:ctrlPr>
+                    <w:rPr>
+                      <w:rFonts w:ascii="Cambria Math" w:eastAsiaTheme="minorEastAsia" w:hAnsi="Cambria Math"/>
+                      <w:i/>
+                      <w:sz w:val="24"/>
+                      <w:szCs w:val="24"/>
+                    </w:rPr>
+                  </m:ctrlPr>
+                </m:dPr>
+                <m:e>
+                  <m:sSub>
+                    <m:sSubPr>
+                      <m:ctrlPr>
+                        <w:rPr>
+                          <w:rFonts w:ascii="Cambria Math" w:eastAsiaTheme="minorEastAsia" w:hAnsi="Cambria Math"/>
+                          <w:i/>
+                          <w:sz w:val="24"/>
+                          <w:szCs w:val="24"/>
+                        </w:rPr>
+                      </m:ctrlPr>
+                    </m:sSubPr>
+                    <m:e>
+                      <m:r>
+                        <w:rPr>
+                          <w:rFonts w:ascii="Cambria Math" w:eastAsiaTheme="minorEastAsia" w:hAnsi="Cambria Math"/>
+                          <w:sz w:val="24"/>
+                          <w:szCs w:val="24"/>
+                        </w:rPr>
+                        <m:t>q</m:t>
+                      </m:r>
+                    </m:e>
+                    <m:sub>
+                      <m:r>
+                        <w:rPr>
+                          <w:rFonts w:ascii="Cambria Math" w:eastAsiaTheme="minorEastAsia" w:hAnsi="Cambria Math"/>
+                          <w:sz w:val="24"/>
+                          <w:szCs w:val="24"/>
+                        </w:rPr>
+                        <m:t>1</m:t>
+                      </m:r>
+                    </m:sub>
+                  </m:sSub>
+                  <m:r>
+                    <w:rPr>
+                      <w:rFonts w:ascii="Cambria Math" w:eastAsiaTheme="minorEastAsia" w:hAnsi="Cambria Math"/>
+                      <w:sz w:val="24"/>
+                      <w:szCs w:val="24"/>
+                    </w:rPr>
+                    <m:t>,A</m:t>
+                  </m:r>
+                  <m:r>
+                    <w:rPr>
+                      <w:rFonts w:ascii="Cambria Math" w:eastAsiaTheme="minorEastAsia" w:hAnsi="Cambria Math"/>
+                      <w:sz w:val="24"/>
+                      <w:szCs w:val="24"/>
+                    </w:rPr>
+                    <m:t>A</m:t>
+                  </m:r>
+                </m:e>
+              </m:d>
+            </m:e>
+          </m:d>
+        </m:oMath>
+      </m:oMathPara>
+    </w:p>
+    <w:p>
+      <w:pPr>
+        <w:spacing w:after="0"/>
+        <w:ind w:left="1440"/>
+        <w:rPr>
+          <w:rFonts w:eastAsiaTheme="minorEastAsia"/>
+          <w:sz w:val="24"/>
+          <w:szCs w:val="24"/>
+        </w:rPr>
+      </w:pPr>
+      <m:oMathPara>
+        <m:oMathParaPr>
+          <m:jc m:val="left"/>
+        </m:oMathParaPr>
+        <m:oMath>
+          <m:r>
+            <w:rPr>
+              <w:rFonts w:ascii="Cambria Math" w:eastAsiaTheme="minorEastAsia" w:hAnsi="Cambria Math"/>
+              <w:sz w:val="24"/>
+              <w:szCs w:val="24"/>
+            </w:rPr>
+            <m:t>δ</m:t>
+          </m:r>
+          <m:d>
+            <m:dPr>
+              <m:ctrlPr>
+                <w:rPr>
+                  <w:rFonts w:ascii="Cambria Math" w:eastAsiaTheme="minorEastAsia" w:hAnsi="Cambria Math"/>
+                  <w:i/>
+                  <w:sz w:val="24"/>
+                  <w:szCs w:val="24"/>
+                </w:rPr>
+              </m:ctrlPr>
+            </m:dPr>
+            <m:e>
+              <m:sSub>
+                <m:sSubPr>
+                  <m:ctrlPr>
+                    <w:rPr>
+                      <w:rFonts w:ascii="Cambria Math" w:eastAsiaTheme="minorEastAsia" w:hAnsi="Cambria Math"/>
+                      <w:i/>
+                      <w:sz w:val="24"/>
+                      <w:szCs w:val="24"/>
+                    </w:rPr>
+                  </m:ctrlPr>
+                </m:sSubPr>
+                <m:e>
+                  <m:r>
+                    <w:rPr>
+                      <w:rFonts w:ascii="Cambria Math" w:eastAsiaTheme="minorEastAsia" w:hAnsi="Cambria Math"/>
+                      <w:sz w:val="24"/>
+                      <w:szCs w:val="24"/>
+                    </w:rPr>
+                    <m:t>q</m:t>
+                  </m:r>
+                </m:e>
+                <m:sub>
+                  <m:r>
+                    <w:rPr>
+                      <w:rFonts w:ascii="Cambria Math" w:eastAsiaTheme="minorEastAsia" w:hAnsi="Cambria Math"/>
+                      <w:sz w:val="24"/>
+                      <w:szCs w:val="24"/>
+                    </w:rPr>
+                    <m:t>1</m:t>
+                  </m:r>
+                </m:sub>
+              </m:sSub>
+              <m:r>
+                <w:rPr>
+                  <w:rFonts w:ascii="Cambria Math" w:eastAsiaTheme="minorEastAsia" w:hAnsi="Cambria Math"/>
+                  <w:sz w:val="24"/>
+                  <w:szCs w:val="24"/>
+                </w:rPr>
+                <m:t>,a,</m:t>
+              </m:r>
+              <m:r>
+                <w:rPr>
+                  <w:rFonts w:ascii="Cambria Math" w:eastAsiaTheme="minorEastAsia" w:hAnsi="Cambria Math"/>
+                  <w:sz w:val="24"/>
+                  <w:szCs w:val="24"/>
+                </w:rPr>
+                <m:t>B</m:t>
+              </m:r>
+            </m:e>
+          </m:d>
+          <m:r>
+            <w:rPr>
+              <w:rFonts w:ascii="Cambria Math" w:eastAsiaTheme="minorEastAsia" w:hAnsi="Cambria Math"/>
+              <w:sz w:val="24"/>
+              <w:szCs w:val="24"/>
+            </w:rPr>
+            <m:t>=</m:t>
+          </m:r>
+          <m:d>
+            <m:dPr>
+              <m:begChr m:val="{"/>
+              <m:endChr m:val="}"/>
+              <m:ctrlPr>
+                <w:rPr>
+                  <w:rFonts w:ascii="Cambria Math" w:eastAsiaTheme="minorEastAsia" w:hAnsi="Cambria Math"/>
+                  <w:i/>
+                  <w:sz w:val="24"/>
+                  <w:szCs w:val="24"/>
+                </w:rPr>
+              </m:ctrlPr>
+            </m:dPr>
+            <m:e>
+              <m:d>
+                <m:dPr>
+                  <m:ctrlPr>
+                    <w:rPr>
+                      <w:rFonts w:ascii="Cambria Math" w:eastAsiaTheme="minorEastAsia" w:hAnsi="Cambria Math"/>
+                      <w:i/>
+                      <w:sz w:val="24"/>
+                      <w:szCs w:val="24"/>
+                    </w:rPr>
+                  </m:ctrlPr>
+                </m:dPr>
+                <m:e>
+                  <m:sSub>
+                    <m:sSubPr>
+                      <m:ctrlPr>
+                        <w:rPr>
+                          <w:rFonts w:ascii="Cambria Math" w:eastAsiaTheme="minorEastAsia" w:hAnsi="Cambria Math"/>
+                          <w:i/>
+                          <w:sz w:val="24"/>
+                          <w:szCs w:val="24"/>
+                        </w:rPr>
+                      </m:ctrlPr>
+                    </m:sSubPr>
+                    <m:e>
+                      <m:r>
+                        <w:rPr>
+                          <w:rFonts w:ascii="Cambria Math" w:eastAsiaTheme="minorEastAsia" w:hAnsi="Cambria Math"/>
+                          <w:sz w:val="24"/>
+                          <w:szCs w:val="24"/>
+                        </w:rPr>
+                        <m:t>q</m:t>
+                      </m:r>
+                    </m:e>
+                    <m:sub>
+                      <m:r>
+                        <w:rPr>
+                          <w:rFonts w:ascii="Cambria Math" w:eastAsiaTheme="minorEastAsia" w:hAnsi="Cambria Math"/>
+                          <w:sz w:val="24"/>
+                          <w:szCs w:val="24"/>
+                        </w:rPr>
+                        <m:t>1</m:t>
+                      </m:r>
+                    </m:sub>
+                  </m:sSub>
+                  <m:r>
+                    <w:rPr>
+                      <w:rFonts w:ascii="Cambria Math" w:eastAsiaTheme="minorEastAsia" w:hAnsi="Cambria Math"/>
+                      <w:sz w:val="24"/>
+                      <w:szCs w:val="24"/>
+                    </w:rPr>
+                    <m:t>,</m:t>
+                  </m:r>
+                  <m:r>
+                    <w:rPr>
+                      <w:rFonts w:ascii="Cambria Math" w:eastAsiaTheme="minorEastAsia" w:hAnsi="Cambria Math"/>
+                      <w:sz w:val="24"/>
+                      <w:szCs w:val="24"/>
+                    </w:rPr>
+                    <m:t>λ</m:t>
+                  </m:r>
+                </m:e>
+              </m:d>
+            </m:e>
+          </m:d>
+        </m:oMath>
+      </m:oMathPara>
+    </w:p>
+    <w:p>
+      <w:pPr>
+        <w:spacing w:after="0"/>
+        <w:ind w:left="1440"/>
+        <w:rPr>
+          <w:rFonts w:eastAsiaTheme="minorEastAsia"/>
+          <w:sz w:val="24"/>
+          <w:szCs w:val="24"/>
+        </w:rPr>
+      </w:pPr>
+      <m:oMathPara>
+        <m:oMathParaPr>
+          <m:jc m:val="left"/>
+        </m:oMathParaPr>
+        <m:oMath>
+          <m:r>
+            <w:rPr>
+              <w:rFonts w:ascii="Cambria Math" w:eastAsiaTheme="minorEastAsia" w:hAnsi="Cambria Math"/>
+              <w:sz w:val="24"/>
+              <w:szCs w:val="24"/>
+            </w:rPr>
+            <m:t>δ</m:t>
+          </m:r>
+          <m:d>
+            <m:dPr>
+              <m:ctrlPr>
+                <w:rPr>
+                  <w:rFonts w:ascii="Cambria Math" w:eastAsiaTheme="minorEastAsia" w:hAnsi="Cambria Math"/>
+                  <w:i/>
+                  <w:sz w:val="24"/>
+                  <w:szCs w:val="24"/>
+                </w:rPr>
+              </m:ctrlPr>
+            </m:dPr>
+            <m:e>
+              <m:sSub>
+                <m:sSubPr>
+                  <m:ctrlPr>
+                    <w:rPr>
+                      <w:rFonts w:ascii="Cambria Math" w:eastAsiaTheme="minorEastAsia" w:hAnsi="Cambria Math"/>
+                      <w:i/>
+                      <w:sz w:val="24"/>
+                      <w:szCs w:val="24"/>
+                    </w:rPr>
+                  </m:ctrlPr>
+                </m:sSubPr>
+                <m:e>
+                  <m:r>
+                    <w:rPr>
+                      <w:rFonts w:ascii="Cambria Math" w:eastAsiaTheme="minorEastAsia" w:hAnsi="Cambria Math"/>
+                      <w:sz w:val="24"/>
+                      <w:szCs w:val="24"/>
+                    </w:rPr>
+                    <m:t>q</m:t>
+                  </m:r>
+                </m:e>
+                <m:sub>
+                  <m:r>
+                    <w:rPr>
+                      <w:rFonts w:ascii="Cambria Math" w:eastAsiaTheme="minorEastAsia" w:hAnsi="Cambria Math"/>
+                      <w:sz w:val="24"/>
+                      <w:szCs w:val="24"/>
+                    </w:rPr>
+                    <m:t>1</m:t>
+                  </m:r>
+                </m:sub>
+              </m:sSub>
+              <m:r>
+                <w:rPr>
+                  <w:rFonts w:ascii="Cambria Math" w:eastAsiaTheme="minorEastAsia" w:hAnsi="Cambria Math"/>
+                  <w:sz w:val="24"/>
+                  <w:szCs w:val="24"/>
+                </w:rPr>
+                <m:t>,</m:t>
+              </m:r>
+              <m:r>
+                <w:rPr>
+                  <w:rFonts w:ascii="Cambria Math" w:eastAsiaTheme="minorEastAsia" w:hAnsi="Cambria Math"/>
+                  <w:sz w:val="24"/>
+                  <w:szCs w:val="24"/>
+                </w:rPr>
+                <m:t>b</m:t>
+              </m:r>
+              <m:r>
+                <w:rPr>
+                  <w:rFonts w:ascii="Cambria Math" w:eastAsiaTheme="minorEastAsia" w:hAnsi="Cambria Math"/>
+                  <w:sz w:val="24"/>
+                  <w:szCs w:val="24"/>
+                </w:rPr>
+                <m:t>,Z</m:t>
+              </m:r>
+            </m:e>
+          </m:d>
+          <m:r>
+            <w:rPr>
+              <w:rFonts w:ascii="Cambria Math" w:eastAsiaTheme="minorEastAsia" w:hAnsi="Cambria Math"/>
+              <w:sz w:val="24"/>
+              <w:szCs w:val="24"/>
+            </w:rPr>
+            <m:t>=</m:t>
+          </m:r>
+          <m:d>
+            <m:dPr>
+              <m:begChr m:val="{"/>
+              <m:endChr m:val="}"/>
+              <m:ctrlPr>
+                <w:rPr>
+                  <w:rFonts w:ascii="Cambria Math" w:eastAsiaTheme="minorEastAsia" w:hAnsi="Cambria Math"/>
+                  <w:i/>
+                  <w:sz w:val="24"/>
+                  <w:szCs w:val="24"/>
+                </w:rPr>
+              </m:ctrlPr>
+            </m:dPr>
+            <m:e>
+              <m:d>
+                <m:dPr>
+                  <m:ctrlPr>
+                    <w:rPr>
+                      <w:rFonts w:ascii="Cambria Math" w:eastAsiaTheme="minorEastAsia" w:hAnsi="Cambria Math"/>
+                      <w:i/>
+                      <w:sz w:val="24"/>
+                      <w:szCs w:val="24"/>
+                    </w:rPr>
+                  </m:ctrlPr>
+                </m:dPr>
+                <m:e>
+                  <m:sSub>
+                    <m:sSubPr>
+                      <m:ctrlPr>
+                        <w:rPr>
+                          <w:rFonts w:ascii="Cambria Math" w:eastAsiaTheme="minorEastAsia" w:hAnsi="Cambria Math"/>
+                          <w:i/>
+                          <w:sz w:val="24"/>
+                          <w:szCs w:val="24"/>
+                        </w:rPr>
+                      </m:ctrlPr>
+                    </m:sSubPr>
+                    <m:e>
+                      <m:r>
+                        <w:rPr>
+                          <w:rFonts w:ascii="Cambria Math" w:eastAsiaTheme="minorEastAsia" w:hAnsi="Cambria Math"/>
+                          <w:sz w:val="24"/>
+                          <w:szCs w:val="24"/>
+                        </w:rPr>
+                        <m:t>q</m:t>
+                      </m:r>
+                    </m:e>
+                    <m:sub>
+                      <m:r>
+                        <w:rPr>
+                          <w:rFonts w:ascii="Cambria Math" w:eastAsiaTheme="minorEastAsia" w:hAnsi="Cambria Math"/>
+                          <w:sz w:val="24"/>
+                          <w:szCs w:val="24"/>
+                        </w:rPr>
+                        <m:t>1</m:t>
+                      </m:r>
+                    </m:sub>
+                  </m:sSub>
+                  <m:r>
+                    <w:rPr>
+                      <w:rFonts w:ascii="Cambria Math" w:eastAsiaTheme="minorEastAsia" w:hAnsi="Cambria Math"/>
+                      <w:sz w:val="24"/>
+                      <w:szCs w:val="24"/>
+                    </w:rPr>
+                    <m:t>,</m:t>
+                  </m:r>
+                  <m:r>
+                    <w:rPr>
+                      <w:rFonts w:ascii="Cambria Math" w:eastAsiaTheme="minorEastAsia" w:hAnsi="Cambria Math"/>
+                      <w:sz w:val="24"/>
+                      <w:szCs w:val="24"/>
+                    </w:rPr>
+                    <m:t>B</m:t>
+                  </m:r>
+                  <m:r>
+                    <w:rPr>
+                      <w:rFonts w:ascii="Cambria Math" w:eastAsiaTheme="minorEastAsia" w:hAnsi="Cambria Math"/>
+                      <w:sz w:val="24"/>
+                      <w:szCs w:val="24"/>
+                    </w:rPr>
+                    <m:t>Z</m:t>
+                  </m:r>
+                </m:e>
+              </m:d>
+            </m:e>
+          </m:d>
+        </m:oMath>
+      </m:oMathPara>
+    </w:p>
+    <w:p>
+      <w:pPr>
+        <w:spacing w:after="0"/>
+        <w:ind w:left="1440"/>
+        <w:rPr>
+          <w:rFonts w:eastAsiaTheme="minorEastAsia"/>
+          <w:sz w:val="24"/>
+          <w:szCs w:val="24"/>
+        </w:rPr>
+      </w:pPr>
+      <m:oMathPara>
+        <m:oMathParaPr>
+          <m:jc m:val="left"/>
+        </m:oMathParaPr>
+        <m:oMath>
+          <m:r>
+            <w:rPr>
+              <w:rFonts w:ascii="Cambria Math" w:eastAsiaTheme="minorEastAsia" w:hAnsi="Cambria Math"/>
+              <w:sz w:val="24"/>
+              <w:szCs w:val="24"/>
+            </w:rPr>
+            <m:t>δ</m:t>
+          </m:r>
+          <m:d>
+            <m:dPr>
+              <m:ctrlPr>
+                <w:rPr>
+                  <w:rFonts w:ascii="Cambria Math" w:eastAsiaTheme="minorEastAsia" w:hAnsi="Cambria Math"/>
+                  <w:i/>
+                  <w:sz w:val="24"/>
+                  <w:szCs w:val="24"/>
+                </w:rPr>
+              </m:ctrlPr>
+            </m:dPr>
+            <m:e>
+              <m:sSub>
+                <m:sSubPr>
+                  <m:ctrlPr>
+                    <w:rPr>
+                      <w:rFonts w:ascii="Cambria Math" w:eastAsiaTheme="minorEastAsia" w:hAnsi="Cambria Math"/>
+                      <w:i/>
+                      <w:sz w:val="24"/>
+                      <w:szCs w:val="24"/>
+                    </w:rPr>
+                  </m:ctrlPr>
+                </m:sSubPr>
+                <m:e>
+                  <m:r>
+                    <w:rPr>
+                      <w:rFonts w:ascii="Cambria Math" w:eastAsiaTheme="minorEastAsia" w:hAnsi="Cambria Math"/>
+                      <w:sz w:val="24"/>
+                      <w:szCs w:val="24"/>
+                    </w:rPr>
+                    <m:t>q</m:t>
+                  </m:r>
+                </m:e>
+                <m:sub>
+                  <m:r>
+                    <w:rPr>
+                      <w:rFonts w:ascii="Cambria Math" w:eastAsiaTheme="minorEastAsia" w:hAnsi="Cambria Math"/>
+                      <w:sz w:val="24"/>
+                      <w:szCs w:val="24"/>
+                    </w:rPr>
+                    <m:t>1</m:t>
+                  </m:r>
+                </m:sub>
+              </m:sSub>
+              <m:r>
+                <w:rPr>
+                  <w:rFonts w:ascii="Cambria Math" w:eastAsiaTheme="minorEastAsia" w:hAnsi="Cambria Math"/>
+                  <w:sz w:val="24"/>
+                  <w:szCs w:val="24"/>
+                </w:rPr>
+                <m:t>,b,</m:t>
+              </m:r>
+              <m:r>
+                <w:rPr>
+                  <w:rFonts w:ascii="Cambria Math" w:eastAsiaTheme="minorEastAsia" w:hAnsi="Cambria Math"/>
+                  <w:sz w:val="24"/>
+                  <w:szCs w:val="24"/>
+                </w:rPr>
+                <m:t>A</m:t>
+              </m:r>
+            </m:e>
+          </m:d>
+          <m:r>
+            <w:rPr>
+              <w:rFonts w:ascii="Cambria Math" w:eastAsiaTheme="minorEastAsia" w:hAnsi="Cambria Math"/>
+              <w:sz w:val="24"/>
+              <w:szCs w:val="24"/>
+            </w:rPr>
+            <m:t>=</m:t>
+          </m:r>
+          <m:d>
+            <m:dPr>
+              <m:begChr m:val="{"/>
+              <m:endChr m:val="}"/>
+              <m:ctrlPr>
+                <w:rPr>
+                  <w:rFonts w:ascii="Cambria Math" w:eastAsiaTheme="minorEastAsia" w:hAnsi="Cambria Math"/>
+                  <w:i/>
+                  <w:sz w:val="24"/>
+                  <w:szCs w:val="24"/>
+                </w:rPr>
+              </m:ctrlPr>
+            </m:dPr>
+            <m:e>
+              <m:d>
+                <m:dPr>
+                  <m:ctrlPr>
+                    <w:rPr>
+                      <w:rFonts w:ascii="Cambria Math" w:eastAsiaTheme="minorEastAsia" w:hAnsi="Cambria Math"/>
+                      <w:i/>
+                      <w:sz w:val="24"/>
+                      <w:szCs w:val="24"/>
+                    </w:rPr>
+                  </m:ctrlPr>
+                </m:dPr>
+                <m:e>
+                  <m:sSub>
+                    <m:sSubPr>
+                      <m:ctrlPr>
+                        <w:rPr>
+                          <w:rFonts w:ascii="Cambria Math" w:eastAsiaTheme="minorEastAsia" w:hAnsi="Cambria Math"/>
+                          <w:i/>
+                          <w:sz w:val="24"/>
+                          <w:szCs w:val="24"/>
+                        </w:rPr>
+                      </m:ctrlPr>
+                    </m:sSubPr>
+                    <m:e>
+                      <m:r>
+                        <w:rPr>
+                          <w:rFonts w:ascii="Cambria Math" w:eastAsiaTheme="minorEastAsia" w:hAnsi="Cambria Math"/>
+                          <w:sz w:val="24"/>
+                          <w:szCs w:val="24"/>
+                        </w:rPr>
+                        <m:t>q</m:t>
+                      </m:r>
+                    </m:e>
+                    <m:sub>
+                      <m:r>
+                        <w:rPr>
+                          <w:rFonts w:ascii="Cambria Math" w:eastAsiaTheme="minorEastAsia" w:hAnsi="Cambria Math"/>
+                          <w:sz w:val="24"/>
+                          <w:szCs w:val="24"/>
+                        </w:rPr>
+                        <m:t>1</m:t>
+                      </m:r>
+                    </m:sub>
+                  </m:sSub>
+                  <m:r>
+                    <w:rPr>
+                      <w:rFonts w:ascii="Cambria Math" w:eastAsiaTheme="minorEastAsia" w:hAnsi="Cambria Math"/>
+                      <w:sz w:val="24"/>
+                      <w:szCs w:val="24"/>
+                    </w:rPr>
                     <m:t>,λ</m:t>
                   </m:r>
                 </m:e>
@@ -3065,6 +1847,887 @@
           </m:d>
         </m:oMath>
       </m:oMathPara>
+    </w:p>
+    <w:p>
+      <w:pPr>
+        <w:spacing w:after="0"/>
+        <w:ind w:left="1440"/>
+        <w:rPr>
+          <w:rFonts w:eastAsiaTheme="minorEastAsia"/>
+          <w:sz w:val="24"/>
+          <w:szCs w:val="24"/>
+        </w:rPr>
+      </w:pPr>
+      <m:oMathPara>
+        <m:oMathParaPr>
+          <m:jc m:val="left"/>
+        </m:oMathParaPr>
+        <m:oMath>
+          <m:r>
+            <w:rPr>
+              <w:rFonts w:ascii="Cambria Math" w:eastAsiaTheme="minorEastAsia" w:hAnsi="Cambria Math"/>
+              <w:sz w:val="24"/>
+              <w:szCs w:val="24"/>
+            </w:rPr>
+            <m:t>δ</m:t>
+          </m:r>
+          <m:d>
+            <m:dPr>
+              <m:ctrlPr>
+                <w:rPr>
+                  <w:rFonts w:ascii="Cambria Math" w:eastAsiaTheme="minorEastAsia" w:hAnsi="Cambria Math"/>
+                  <w:i/>
+                  <w:sz w:val="24"/>
+                  <w:szCs w:val="24"/>
+                </w:rPr>
+              </m:ctrlPr>
+            </m:dPr>
+            <m:e>
+              <m:sSub>
+                <m:sSubPr>
+                  <m:ctrlPr>
+                    <w:rPr>
+                      <w:rFonts w:ascii="Cambria Math" w:eastAsiaTheme="minorEastAsia" w:hAnsi="Cambria Math"/>
+                      <w:i/>
+                      <w:sz w:val="24"/>
+                      <w:szCs w:val="24"/>
+                    </w:rPr>
+                  </m:ctrlPr>
+                </m:sSubPr>
+                <m:e>
+                  <m:r>
+                    <w:rPr>
+                      <w:rFonts w:ascii="Cambria Math" w:eastAsiaTheme="minorEastAsia" w:hAnsi="Cambria Math"/>
+                      <w:sz w:val="24"/>
+                      <w:szCs w:val="24"/>
+                    </w:rPr>
+                    <m:t>q</m:t>
+                  </m:r>
+                </m:e>
+                <m:sub>
+                  <m:r>
+                    <w:rPr>
+                      <w:rFonts w:ascii="Cambria Math" w:eastAsiaTheme="minorEastAsia" w:hAnsi="Cambria Math"/>
+                      <w:sz w:val="24"/>
+                      <w:szCs w:val="24"/>
+                    </w:rPr>
+                    <m:t>1</m:t>
+                  </m:r>
+                </m:sub>
+              </m:sSub>
+              <m:r>
+                <w:rPr>
+                  <w:rFonts w:ascii="Cambria Math" w:eastAsiaTheme="minorEastAsia" w:hAnsi="Cambria Math"/>
+                  <w:sz w:val="24"/>
+                  <w:szCs w:val="24"/>
+                </w:rPr>
+                <m:t>,b,</m:t>
+              </m:r>
+              <m:r>
+                <w:rPr>
+                  <w:rFonts w:ascii="Cambria Math" w:eastAsiaTheme="minorEastAsia" w:hAnsi="Cambria Math"/>
+                  <w:sz w:val="24"/>
+                  <w:szCs w:val="24"/>
+                </w:rPr>
+                <m:t>B</m:t>
+              </m:r>
+            </m:e>
+          </m:d>
+          <m:r>
+            <w:rPr>
+              <w:rFonts w:ascii="Cambria Math" w:eastAsiaTheme="minorEastAsia" w:hAnsi="Cambria Math"/>
+              <w:sz w:val="24"/>
+              <w:szCs w:val="24"/>
+            </w:rPr>
+            <m:t>=</m:t>
+          </m:r>
+          <m:d>
+            <m:dPr>
+              <m:begChr m:val="{"/>
+              <m:endChr m:val="}"/>
+              <m:ctrlPr>
+                <w:rPr>
+                  <w:rFonts w:ascii="Cambria Math" w:eastAsiaTheme="minorEastAsia" w:hAnsi="Cambria Math"/>
+                  <w:i/>
+                  <w:sz w:val="24"/>
+                  <w:szCs w:val="24"/>
+                </w:rPr>
+              </m:ctrlPr>
+            </m:dPr>
+            <m:e>
+              <m:d>
+                <m:dPr>
+                  <m:ctrlPr>
+                    <w:rPr>
+                      <w:rFonts w:ascii="Cambria Math" w:eastAsiaTheme="minorEastAsia" w:hAnsi="Cambria Math"/>
+                      <w:i/>
+                      <w:sz w:val="24"/>
+                      <w:szCs w:val="24"/>
+                    </w:rPr>
+                  </m:ctrlPr>
+                </m:dPr>
+                <m:e>
+                  <m:sSub>
+                    <m:sSubPr>
+                      <m:ctrlPr>
+                        <w:rPr>
+                          <w:rFonts w:ascii="Cambria Math" w:eastAsiaTheme="minorEastAsia" w:hAnsi="Cambria Math"/>
+                          <w:i/>
+                          <w:sz w:val="24"/>
+                          <w:szCs w:val="24"/>
+                        </w:rPr>
+                      </m:ctrlPr>
+                    </m:sSubPr>
+                    <m:e>
+                      <m:r>
+                        <w:rPr>
+                          <w:rFonts w:ascii="Cambria Math" w:eastAsiaTheme="minorEastAsia" w:hAnsi="Cambria Math"/>
+                          <w:sz w:val="24"/>
+                          <w:szCs w:val="24"/>
+                        </w:rPr>
+                        <m:t>q</m:t>
+                      </m:r>
+                    </m:e>
+                    <m:sub>
+                      <m:r>
+                        <w:rPr>
+                          <w:rFonts w:ascii="Cambria Math" w:eastAsiaTheme="minorEastAsia" w:hAnsi="Cambria Math"/>
+                          <w:sz w:val="24"/>
+                          <w:szCs w:val="24"/>
+                        </w:rPr>
+                        <m:t>1</m:t>
+                      </m:r>
+                    </m:sub>
+                  </m:sSub>
+                  <m:r>
+                    <w:rPr>
+                      <w:rFonts w:ascii="Cambria Math" w:eastAsiaTheme="minorEastAsia" w:hAnsi="Cambria Math"/>
+                      <w:sz w:val="24"/>
+                      <w:szCs w:val="24"/>
+                    </w:rPr>
+                    <m:t>,</m:t>
+                  </m:r>
+                  <m:r>
+                    <w:rPr>
+                      <w:rFonts w:ascii="Cambria Math" w:eastAsiaTheme="minorEastAsia" w:hAnsi="Cambria Math"/>
+                      <w:sz w:val="24"/>
+                      <w:szCs w:val="24"/>
+                    </w:rPr>
+                    <m:t>BB</m:t>
+                  </m:r>
+                </m:e>
+              </m:d>
+            </m:e>
+          </m:d>
+        </m:oMath>
+      </m:oMathPara>
+    </w:p>
+    <w:p>
+      <w:pPr>
+        <w:spacing w:after="0"/>
+        <w:ind w:left="1440"/>
+        <w:rPr>
+          <w:rFonts w:eastAsiaTheme="minorEastAsia"/>
+          <w:sz w:val="24"/>
+          <w:szCs w:val="24"/>
+        </w:rPr>
+      </w:pPr>
+      <m:oMathPara>
+        <m:oMathParaPr>
+          <m:jc m:val="left"/>
+        </m:oMathParaPr>
+        <m:oMath>
+          <m:r>
+            <w:rPr>
+              <w:rFonts w:ascii="Cambria Math" w:eastAsiaTheme="minorEastAsia" w:hAnsi="Cambria Math"/>
+              <w:sz w:val="24"/>
+              <w:szCs w:val="24"/>
+            </w:rPr>
+            <m:t>δ</m:t>
+          </m:r>
+          <m:d>
+            <m:dPr>
+              <m:ctrlPr>
+                <w:rPr>
+                  <w:rFonts w:ascii="Cambria Math" w:eastAsiaTheme="minorEastAsia" w:hAnsi="Cambria Math"/>
+                  <w:i/>
+                  <w:sz w:val="24"/>
+                  <w:szCs w:val="24"/>
+                </w:rPr>
+              </m:ctrlPr>
+            </m:dPr>
+            <m:e>
+              <m:sSub>
+                <m:sSubPr>
+                  <m:ctrlPr>
+                    <w:rPr>
+                      <w:rFonts w:ascii="Cambria Math" w:eastAsiaTheme="minorEastAsia" w:hAnsi="Cambria Math"/>
+                      <w:i/>
+                      <w:sz w:val="24"/>
+                      <w:szCs w:val="24"/>
+                    </w:rPr>
+                  </m:ctrlPr>
+                </m:sSubPr>
+                <m:e>
+                  <m:r>
+                    <w:rPr>
+                      <w:rFonts w:ascii="Cambria Math" w:eastAsiaTheme="minorEastAsia" w:hAnsi="Cambria Math"/>
+                      <w:sz w:val="24"/>
+                      <w:szCs w:val="24"/>
+                    </w:rPr>
+                    <m:t>q</m:t>
+                  </m:r>
+                </m:e>
+                <m:sub>
+                  <m:r>
+                    <w:rPr>
+                      <w:rFonts w:ascii="Cambria Math" w:eastAsiaTheme="minorEastAsia" w:hAnsi="Cambria Math"/>
+                      <w:sz w:val="24"/>
+                      <w:szCs w:val="24"/>
+                    </w:rPr>
+                    <m:t>1</m:t>
+                  </m:r>
+                </m:sub>
+              </m:sSub>
+              <m:r>
+                <w:rPr>
+                  <w:rFonts w:ascii="Cambria Math" w:eastAsiaTheme="minorEastAsia" w:hAnsi="Cambria Math"/>
+                  <w:sz w:val="24"/>
+                  <w:szCs w:val="24"/>
+                </w:rPr>
+                <m:t>,</m:t>
+              </m:r>
+              <m:r>
+                <w:rPr>
+                  <w:rFonts w:ascii="Cambria Math" w:eastAsiaTheme="minorEastAsia" w:hAnsi="Cambria Math"/>
+                  <w:sz w:val="24"/>
+                  <w:szCs w:val="24"/>
+                </w:rPr>
+                <m:t>c</m:t>
+              </m:r>
+              <m:r>
+                <w:rPr>
+                  <w:rFonts w:ascii="Cambria Math" w:eastAsiaTheme="minorEastAsia" w:hAnsi="Cambria Math"/>
+                  <w:sz w:val="24"/>
+                  <w:szCs w:val="24"/>
+                </w:rPr>
+                <m:t>,Z</m:t>
+              </m:r>
+            </m:e>
+          </m:d>
+          <m:r>
+            <w:rPr>
+              <w:rFonts w:ascii="Cambria Math" w:eastAsiaTheme="minorEastAsia" w:hAnsi="Cambria Math"/>
+              <w:sz w:val="24"/>
+              <w:szCs w:val="24"/>
+            </w:rPr>
+            <m:t>=</m:t>
+          </m:r>
+          <m:d>
+            <m:dPr>
+              <m:begChr m:val="{"/>
+              <m:endChr m:val="}"/>
+              <m:ctrlPr>
+                <w:rPr>
+                  <w:rFonts w:ascii="Cambria Math" w:eastAsiaTheme="minorEastAsia" w:hAnsi="Cambria Math"/>
+                  <w:i/>
+                  <w:sz w:val="24"/>
+                  <w:szCs w:val="24"/>
+                </w:rPr>
+              </m:ctrlPr>
+            </m:dPr>
+            <m:e>
+              <m:d>
+                <m:dPr>
+                  <m:ctrlPr>
+                    <w:rPr>
+                      <w:rFonts w:ascii="Cambria Math" w:eastAsiaTheme="minorEastAsia" w:hAnsi="Cambria Math"/>
+                      <w:i/>
+                      <w:sz w:val="24"/>
+                      <w:szCs w:val="24"/>
+                    </w:rPr>
+                  </m:ctrlPr>
+                </m:dPr>
+                <m:e>
+                  <m:sSub>
+                    <m:sSubPr>
+                      <m:ctrlPr>
+                        <w:rPr>
+                          <w:rFonts w:ascii="Cambria Math" w:eastAsiaTheme="minorEastAsia" w:hAnsi="Cambria Math"/>
+                          <w:i/>
+                          <w:sz w:val="24"/>
+                          <w:szCs w:val="24"/>
+                        </w:rPr>
+                      </m:ctrlPr>
+                    </m:sSubPr>
+                    <m:e>
+                      <m:r>
+                        <w:rPr>
+                          <w:rFonts w:ascii="Cambria Math" w:eastAsiaTheme="minorEastAsia" w:hAnsi="Cambria Math"/>
+                          <w:sz w:val="24"/>
+                          <w:szCs w:val="24"/>
+                        </w:rPr>
+                        <m:t>q</m:t>
+                      </m:r>
+                    </m:e>
+                    <m:sub>
+                      <m:r>
+                        <w:rPr>
+                          <w:rFonts w:ascii="Cambria Math" w:eastAsiaTheme="minorEastAsia" w:hAnsi="Cambria Math"/>
+                          <w:sz w:val="24"/>
+                          <w:szCs w:val="24"/>
+                        </w:rPr>
+                        <m:t>1</m:t>
+                      </m:r>
+                    </m:sub>
+                  </m:sSub>
+                  <m:r>
+                    <w:rPr>
+                      <w:rFonts w:ascii="Cambria Math" w:eastAsiaTheme="minorEastAsia" w:hAnsi="Cambria Math"/>
+                      <w:sz w:val="24"/>
+                      <w:szCs w:val="24"/>
+                    </w:rPr>
+                    <m:t>,Z</m:t>
+                  </m:r>
+                </m:e>
+              </m:d>
+            </m:e>
+          </m:d>
+        </m:oMath>
+      </m:oMathPara>
+    </w:p>
+    <w:p>
+      <w:pPr>
+        <w:spacing w:after="0"/>
+        <w:ind w:left="1440"/>
+        <w:rPr>
+          <w:rFonts w:eastAsiaTheme="minorEastAsia"/>
+          <w:sz w:val="24"/>
+          <w:szCs w:val="24"/>
+        </w:rPr>
+      </w:pPr>
+      <m:oMathPara>
+        <m:oMathParaPr>
+          <m:jc m:val="left"/>
+        </m:oMathParaPr>
+        <m:oMath>
+          <m:r>
+            <w:rPr>
+              <w:rFonts w:ascii="Cambria Math" w:eastAsiaTheme="minorEastAsia" w:hAnsi="Cambria Math"/>
+              <w:sz w:val="24"/>
+              <w:szCs w:val="24"/>
+            </w:rPr>
+            <m:t>δ</m:t>
+          </m:r>
+          <m:d>
+            <m:dPr>
+              <m:ctrlPr>
+                <w:rPr>
+                  <w:rFonts w:ascii="Cambria Math" w:eastAsiaTheme="minorEastAsia" w:hAnsi="Cambria Math"/>
+                  <w:i/>
+                  <w:sz w:val="24"/>
+                  <w:szCs w:val="24"/>
+                </w:rPr>
+              </m:ctrlPr>
+            </m:dPr>
+            <m:e>
+              <m:sSub>
+                <m:sSubPr>
+                  <m:ctrlPr>
+                    <w:rPr>
+                      <w:rFonts w:ascii="Cambria Math" w:eastAsiaTheme="minorEastAsia" w:hAnsi="Cambria Math"/>
+                      <w:i/>
+                      <w:sz w:val="24"/>
+                      <w:szCs w:val="24"/>
+                    </w:rPr>
+                  </m:ctrlPr>
+                </m:sSubPr>
+                <m:e>
+                  <m:r>
+                    <w:rPr>
+                      <w:rFonts w:ascii="Cambria Math" w:eastAsiaTheme="minorEastAsia" w:hAnsi="Cambria Math"/>
+                      <w:sz w:val="24"/>
+                      <w:szCs w:val="24"/>
+                    </w:rPr>
+                    <m:t>q</m:t>
+                  </m:r>
+                </m:e>
+                <m:sub>
+                  <m:r>
+                    <w:rPr>
+                      <w:rFonts w:ascii="Cambria Math" w:eastAsiaTheme="minorEastAsia" w:hAnsi="Cambria Math"/>
+                      <w:sz w:val="24"/>
+                      <w:szCs w:val="24"/>
+                    </w:rPr>
+                    <m:t>1</m:t>
+                  </m:r>
+                </m:sub>
+              </m:sSub>
+              <m:r>
+                <w:rPr>
+                  <w:rFonts w:ascii="Cambria Math" w:eastAsiaTheme="minorEastAsia" w:hAnsi="Cambria Math"/>
+                  <w:sz w:val="24"/>
+                  <w:szCs w:val="24"/>
+                </w:rPr>
+                <m:t>,</m:t>
+              </m:r>
+              <m:r>
+                <w:rPr>
+                  <w:rFonts w:ascii="Cambria Math" w:eastAsiaTheme="minorEastAsia" w:hAnsi="Cambria Math"/>
+                  <w:sz w:val="24"/>
+                  <w:szCs w:val="24"/>
+                </w:rPr>
+                <m:t>c</m:t>
+              </m:r>
+              <m:r>
+                <w:rPr>
+                  <w:rFonts w:ascii="Cambria Math" w:eastAsiaTheme="minorEastAsia" w:hAnsi="Cambria Math"/>
+                  <w:sz w:val="24"/>
+                  <w:szCs w:val="24"/>
+                </w:rPr>
+                <m:t>,A</m:t>
+              </m:r>
+            </m:e>
+          </m:d>
+          <m:r>
+            <w:rPr>
+              <w:rFonts w:ascii="Cambria Math" w:eastAsiaTheme="minorEastAsia" w:hAnsi="Cambria Math"/>
+              <w:sz w:val="24"/>
+              <w:szCs w:val="24"/>
+            </w:rPr>
+            <m:t>=</m:t>
+          </m:r>
+          <m:d>
+            <m:dPr>
+              <m:begChr m:val="{"/>
+              <m:endChr m:val="}"/>
+              <m:ctrlPr>
+                <w:rPr>
+                  <w:rFonts w:ascii="Cambria Math" w:eastAsiaTheme="minorEastAsia" w:hAnsi="Cambria Math"/>
+                  <w:i/>
+                  <w:sz w:val="24"/>
+                  <w:szCs w:val="24"/>
+                </w:rPr>
+              </m:ctrlPr>
+            </m:dPr>
+            <m:e>
+              <m:d>
+                <m:dPr>
+                  <m:ctrlPr>
+                    <w:rPr>
+                      <w:rFonts w:ascii="Cambria Math" w:eastAsiaTheme="minorEastAsia" w:hAnsi="Cambria Math"/>
+                      <w:i/>
+                      <w:sz w:val="24"/>
+                      <w:szCs w:val="24"/>
+                    </w:rPr>
+                  </m:ctrlPr>
+                </m:dPr>
+                <m:e>
+                  <m:sSub>
+                    <m:sSubPr>
+                      <m:ctrlPr>
+                        <w:rPr>
+                          <w:rFonts w:ascii="Cambria Math" w:eastAsiaTheme="minorEastAsia" w:hAnsi="Cambria Math"/>
+                          <w:i/>
+                          <w:sz w:val="24"/>
+                          <w:szCs w:val="24"/>
+                        </w:rPr>
+                      </m:ctrlPr>
+                    </m:sSubPr>
+                    <m:e>
+                      <m:r>
+                        <w:rPr>
+                          <w:rFonts w:ascii="Cambria Math" w:eastAsiaTheme="minorEastAsia" w:hAnsi="Cambria Math"/>
+                          <w:sz w:val="24"/>
+                          <w:szCs w:val="24"/>
+                        </w:rPr>
+                        <m:t>q</m:t>
+                      </m:r>
+                    </m:e>
+                    <m:sub>
+                      <m:r>
+                        <w:rPr>
+                          <w:rFonts w:ascii="Cambria Math" w:eastAsiaTheme="minorEastAsia" w:hAnsi="Cambria Math"/>
+                          <w:sz w:val="24"/>
+                          <w:szCs w:val="24"/>
+                        </w:rPr>
+                        <m:t>1</m:t>
+                      </m:r>
+                    </m:sub>
+                  </m:sSub>
+                  <m:r>
+                    <w:rPr>
+                      <w:rFonts w:ascii="Cambria Math" w:eastAsiaTheme="minorEastAsia" w:hAnsi="Cambria Math"/>
+                      <w:sz w:val="24"/>
+                      <w:szCs w:val="24"/>
+                    </w:rPr>
+                    <m:t>,</m:t>
+                  </m:r>
+                  <m:r>
+                    <w:rPr>
+                      <w:rFonts w:ascii="Cambria Math" w:eastAsiaTheme="minorEastAsia" w:hAnsi="Cambria Math"/>
+                      <w:sz w:val="24"/>
+                      <w:szCs w:val="24"/>
+                    </w:rPr>
+                    <m:t>A</m:t>
+                  </m:r>
+                </m:e>
+              </m:d>
+            </m:e>
+          </m:d>
+        </m:oMath>
+      </m:oMathPara>
+    </w:p>
+    <w:p>
+      <w:pPr>
+        <w:spacing w:after="0"/>
+        <w:ind w:left="1440"/>
+        <w:rPr>
+          <w:rFonts w:eastAsiaTheme="minorEastAsia"/>
+          <w:sz w:val="24"/>
+          <w:szCs w:val="24"/>
+        </w:rPr>
+      </w:pPr>
+      <m:oMathPara>
+        <m:oMathParaPr>
+          <m:jc m:val="left"/>
+        </m:oMathParaPr>
+        <m:oMath>
+          <m:r>
+            <w:rPr>
+              <w:rFonts w:ascii="Cambria Math" w:eastAsiaTheme="minorEastAsia" w:hAnsi="Cambria Math"/>
+              <w:sz w:val="24"/>
+              <w:szCs w:val="24"/>
+            </w:rPr>
+            <m:t>δ</m:t>
+          </m:r>
+          <m:d>
+            <m:dPr>
+              <m:ctrlPr>
+                <w:rPr>
+                  <w:rFonts w:ascii="Cambria Math" w:eastAsiaTheme="minorEastAsia" w:hAnsi="Cambria Math"/>
+                  <w:i/>
+                  <w:sz w:val="24"/>
+                  <w:szCs w:val="24"/>
+                </w:rPr>
+              </m:ctrlPr>
+            </m:dPr>
+            <m:e>
+              <m:sSub>
+                <m:sSubPr>
+                  <m:ctrlPr>
+                    <w:rPr>
+                      <w:rFonts w:ascii="Cambria Math" w:eastAsiaTheme="minorEastAsia" w:hAnsi="Cambria Math"/>
+                      <w:i/>
+                      <w:sz w:val="24"/>
+                      <w:szCs w:val="24"/>
+                    </w:rPr>
+                  </m:ctrlPr>
+                </m:sSubPr>
+                <m:e>
+                  <m:r>
+                    <w:rPr>
+                      <w:rFonts w:ascii="Cambria Math" w:eastAsiaTheme="minorEastAsia" w:hAnsi="Cambria Math"/>
+                      <w:sz w:val="24"/>
+                      <w:szCs w:val="24"/>
+                    </w:rPr>
+                    <m:t>q</m:t>
+                  </m:r>
+                </m:e>
+                <m:sub>
+                  <m:r>
+                    <w:rPr>
+                      <w:rFonts w:ascii="Cambria Math" w:eastAsiaTheme="minorEastAsia" w:hAnsi="Cambria Math"/>
+                      <w:sz w:val="24"/>
+                      <w:szCs w:val="24"/>
+                    </w:rPr>
+                    <m:t>1</m:t>
+                  </m:r>
+                </m:sub>
+              </m:sSub>
+              <m:r>
+                <w:rPr>
+                  <w:rFonts w:ascii="Cambria Math" w:eastAsiaTheme="minorEastAsia" w:hAnsi="Cambria Math"/>
+                  <w:sz w:val="24"/>
+                  <w:szCs w:val="24"/>
+                </w:rPr>
+                <m:t>,</m:t>
+              </m:r>
+              <m:r>
+                <w:rPr>
+                  <w:rFonts w:ascii="Cambria Math" w:eastAsiaTheme="minorEastAsia" w:hAnsi="Cambria Math"/>
+                  <w:sz w:val="24"/>
+                  <w:szCs w:val="24"/>
+                </w:rPr>
+                <m:t>c</m:t>
+              </m:r>
+              <m:r>
+                <w:rPr>
+                  <w:rFonts w:ascii="Cambria Math" w:eastAsiaTheme="minorEastAsia" w:hAnsi="Cambria Math"/>
+                  <w:sz w:val="24"/>
+                  <w:szCs w:val="24"/>
+                </w:rPr>
+                <m:t>,B</m:t>
+              </m:r>
+            </m:e>
+          </m:d>
+          <m:r>
+            <w:rPr>
+              <w:rFonts w:ascii="Cambria Math" w:eastAsiaTheme="minorEastAsia" w:hAnsi="Cambria Math"/>
+              <w:sz w:val="24"/>
+              <w:szCs w:val="24"/>
+            </w:rPr>
+            <m:t>=</m:t>
+          </m:r>
+          <m:d>
+            <m:dPr>
+              <m:begChr m:val="{"/>
+              <m:endChr m:val="}"/>
+              <m:ctrlPr>
+                <w:rPr>
+                  <w:rFonts w:ascii="Cambria Math" w:eastAsiaTheme="minorEastAsia" w:hAnsi="Cambria Math"/>
+                  <w:i/>
+                  <w:sz w:val="24"/>
+                  <w:szCs w:val="24"/>
+                </w:rPr>
+              </m:ctrlPr>
+            </m:dPr>
+            <m:e>
+              <m:d>
+                <m:dPr>
+                  <m:ctrlPr>
+                    <w:rPr>
+                      <w:rFonts w:ascii="Cambria Math" w:eastAsiaTheme="minorEastAsia" w:hAnsi="Cambria Math"/>
+                      <w:i/>
+                      <w:sz w:val="24"/>
+                      <w:szCs w:val="24"/>
+                    </w:rPr>
+                  </m:ctrlPr>
+                </m:dPr>
+                <m:e>
+                  <m:sSub>
+                    <m:sSubPr>
+                      <m:ctrlPr>
+                        <w:rPr>
+                          <w:rFonts w:ascii="Cambria Math" w:eastAsiaTheme="minorEastAsia" w:hAnsi="Cambria Math"/>
+                          <w:i/>
+                          <w:sz w:val="24"/>
+                          <w:szCs w:val="24"/>
+                        </w:rPr>
+                      </m:ctrlPr>
+                    </m:sSubPr>
+                    <m:e>
+                      <m:r>
+                        <w:rPr>
+                          <w:rFonts w:ascii="Cambria Math" w:eastAsiaTheme="minorEastAsia" w:hAnsi="Cambria Math"/>
+                          <w:sz w:val="24"/>
+                          <w:szCs w:val="24"/>
+                        </w:rPr>
+                        <m:t>q</m:t>
+                      </m:r>
+                    </m:e>
+                    <m:sub>
+                      <m:r>
+                        <w:rPr>
+                          <w:rFonts w:ascii="Cambria Math" w:eastAsiaTheme="minorEastAsia" w:hAnsi="Cambria Math"/>
+                          <w:sz w:val="24"/>
+                          <w:szCs w:val="24"/>
+                        </w:rPr>
+                        <m:t>1</m:t>
+                      </m:r>
+                    </m:sub>
+                  </m:sSub>
+                  <m:r>
+                    <w:rPr>
+                      <w:rFonts w:ascii="Cambria Math" w:eastAsiaTheme="minorEastAsia" w:hAnsi="Cambria Math"/>
+                      <w:sz w:val="24"/>
+                      <w:szCs w:val="24"/>
+                    </w:rPr>
+                    <m:t>,B</m:t>
+                  </m:r>
+                </m:e>
+              </m:d>
+            </m:e>
+          </m:d>
+        </m:oMath>
+      </m:oMathPara>
+    </w:p>
+    <w:p>
+      <w:pPr>
+        <w:spacing w:after="0"/>
+        <w:ind w:left="1440"/>
+        <w:rPr>
+          <w:rFonts w:eastAsiaTheme="minorEastAsia"/>
+          <w:sz w:val="24"/>
+          <w:szCs w:val="24"/>
+        </w:rPr>
+      </w:pPr>
+      <m:oMathPara>
+        <m:oMathParaPr>
+          <m:jc m:val="left"/>
+        </m:oMathParaPr>
+        <m:oMath>
+          <m:r>
+            <w:rPr>
+              <w:rFonts w:ascii="Cambria Math" w:eastAsiaTheme="minorEastAsia" w:hAnsi="Cambria Math"/>
+              <w:sz w:val="24"/>
+              <w:szCs w:val="24"/>
+            </w:rPr>
+            <m:t>δ</m:t>
+          </m:r>
+          <m:d>
+            <m:dPr>
+              <m:ctrlPr>
+                <w:rPr>
+                  <w:rFonts w:ascii="Cambria Math" w:eastAsiaTheme="minorEastAsia" w:hAnsi="Cambria Math"/>
+                  <w:i/>
+                  <w:sz w:val="24"/>
+                  <w:szCs w:val="24"/>
+                </w:rPr>
+              </m:ctrlPr>
+            </m:dPr>
+            <m:e>
+              <m:sSub>
+                <m:sSubPr>
+                  <m:ctrlPr>
+                    <w:rPr>
+                      <w:rFonts w:ascii="Cambria Math" w:eastAsiaTheme="minorEastAsia" w:hAnsi="Cambria Math"/>
+                      <w:i/>
+                      <w:sz w:val="24"/>
+                      <w:szCs w:val="24"/>
+                    </w:rPr>
+                  </m:ctrlPr>
+                </m:sSubPr>
+                <m:e>
+                  <m:r>
+                    <w:rPr>
+                      <w:rFonts w:ascii="Cambria Math" w:eastAsiaTheme="minorEastAsia" w:hAnsi="Cambria Math"/>
+                      <w:sz w:val="24"/>
+                      <w:szCs w:val="24"/>
+                    </w:rPr>
+                    <m:t>q</m:t>
+                  </m:r>
+                </m:e>
+                <m:sub>
+                  <m:r>
+                    <w:rPr>
+                      <w:rFonts w:ascii="Cambria Math" w:eastAsiaTheme="minorEastAsia" w:hAnsi="Cambria Math"/>
+                      <w:sz w:val="24"/>
+                      <w:szCs w:val="24"/>
+                    </w:rPr>
+                    <m:t>1</m:t>
+                  </m:r>
+                </m:sub>
+              </m:sSub>
+              <m:r>
+                <w:rPr>
+                  <w:rFonts w:ascii="Cambria Math" w:eastAsiaTheme="minorEastAsia" w:hAnsi="Cambria Math"/>
+                  <w:sz w:val="24"/>
+                  <w:szCs w:val="24"/>
+                </w:rPr>
+                <m:t>,λ,Z</m:t>
+              </m:r>
+            </m:e>
+          </m:d>
+          <m:r>
+            <w:rPr>
+              <w:rFonts w:ascii="Cambria Math" w:eastAsiaTheme="minorEastAsia" w:hAnsi="Cambria Math"/>
+              <w:sz w:val="24"/>
+              <w:szCs w:val="24"/>
+            </w:rPr>
+            <m:t>=</m:t>
+          </m:r>
+          <m:d>
+            <m:dPr>
+              <m:begChr m:val="{"/>
+              <m:endChr m:val="}"/>
+              <m:ctrlPr>
+                <w:rPr>
+                  <w:rFonts w:ascii="Cambria Math" w:eastAsiaTheme="minorEastAsia" w:hAnsi="Cambria Math"/>
+                  <w:i/>
+                  <w:sz w:val="24"/>
+                  <w:szCs w:val="24"/>
+                </w:rPr>
+              </m:ctrlPr>
+            </m:dPr>
+            <m:e>
+              <m:d>
+                <m:dPr>
+                  <m:ctrlPr>
+                    <w:rPr>
+                      <w:rFonts w:ascii="Cambria Math" w:eastAsiaTheme="minorEastAsia" w:hAnsi="Cambria Math"/>
+                      <w:i/>
+                      <w:sz w:val="24"/>
+                      <w:szCs w:val="24"/>
+                    </w:rPr>
+                  </m:ctrlPr>
+                </m:dPr>
+                <m:e>
+                  <m:sSub>
+                    <m:sSubPr>
+                      <m:ctrlPr>
+                        <w:rPr>
+                          <w:rFonts w:ascii="Cambria Math" w:eastAsiaTheme="minorEastAsia" w:hAnsi="Cambria Math"/>
+                          <w:i/>
+                          <w:sz w:val="24"/>
+                          <w:szCs w:val="24"/>
+                        </w:rPr>
+                      </m:ctrlPr>
+                    </m:sSubPr>
+                    <m:e>
+                      <m:r>
+                        <w:rPr>
+                          <w:rFonts w:ascii="Cambria Math" w:eastAsiaTheme="minorEastAsia" w:hAnsi="Cambria Math"/>
+                          <w:sz w:val="24"/>
+                          <w:szCs w:val="24"/>
+                        </w:rPr>
+                        <m:t>q</m:t>
+                      </m:r>
+                    </m:e>
+                    <m:sub>
+                      <m:r>
+                        <w:rPr>
+                          <w:rFonts w:ascii="Cambria Math" w:eastAsiaTheme="minorEastAsia" w:hAnsi="Cambria Math"/>
+                          <w:sz w:val="24"/>
+                          <w:szCs w:val="24"/>
+                        </w:rPr>
+                        <m:t>2</m:t>
+                      </m:r>
+                    </m:sub>
+                  </m:sSub>
+                  <m:r>
+                    <w:rPr>
+                      <w:rFonts w:ascii="Cambria Math" w:eastAsiaTheme="minorEastAsia" w:hAnsi="Cambria Math"/>
+                      <w:sz w:val="24"/>
+                      <w:szCs w:val="24"/>
+                    </w:rPr>
+                    <m:t>,</m:t>
+                  </m:r>
+                  <m:r>
+                    <w:rPr>
+                      <w:rFonts w:ascii="Cambria Math" w:eastAsiaTheme="minorEastAsia" w:hAnsi="Cambria Math"/>
+                      <w:sz w:val="24"/>
+                      <w:szCs w:val="24"/>
+                    </w:rPr>
+                    <m:t>λ</m:t>
+                  </m:r>
+                </m:e>
+              </m:d>
+            </m:e>
+          </m:d>
+        </m:oMath>
+      </m:oMathPara>
+    </w:p>
+    <w:p>
+      <w:pPr>
+        <w:spacing w:after="0"/>
+        <w:ind w:left="1440"/>
+        <w:rPr>
+          <w:rFonts w:eastAsiaTheme="minorEastAsia"/>
+          <w:sz w:val="24"/>
+          <w:szCs w:val="24"/>
+        </w:rPr>
+      </w:pPr>
     </w:p>
     <w:p>
       <w:pPr>
@@ -5038,6 +4701,16 @@
     </w:p>
     <w:p>
       <w:pPr>
+        <w:ind w:left="990"/>
+        <w:rPr>
+          <w:bCs/>
+          <w:sz w:val="24"/>
+          <w:szCs w:val="24"/>
+        </w:rPr>
+      </w:pPr>
+    </w:p>
+    <w:p>
+      <w:pPr>
         <w:pStyle w:val="ListParagraph"/>
         <w:numPr>
           <w:ilvl w:val="0"/>
@@ -8727,25 +8400,7 @@
           <w:sz w:val="24"/>
           <w:szCs w:val="24"/>
         </w:rPr>
-        <w:t>a new symbol is pushed to the stack to indicate the second behavior is required. T</w:t>
-      </w:r>
-      <w:r>
-        <w:rPr>
-          <w:rFonts w:eastAsiaTheme="minorEastAsia"/>
-          <w:bCs/>
-          <w:sz w:val="24"/>
-          <w:szCs w:val="24"/>
-        </w:rPr>
-        <w:t>hen</w:t>
-      </w:r>
-      <w:r>
-        <w:rPr>
-          <w:rFonts w:eastAsiaTheme="minorEastAsia"/>
-          <w:bCs/>
-          <w:sz w:val="24"/>
-          <w:szCs w:val="24"/>
-        </w:rPr>
-        <w:t>,</w:t>
+        <w:t>then</w:t>
       </w:r>
       <w:r>
         <w:rPr>
@@ -8783,16 +8438,16 @@
           <w:sz w:val="24"/>
           <w:szCs w:val="24"/>
         </w:rPr>
-        <w:t xml:space="preserve"> (different from the symbol used with the first behavior)</w:t>
-      </w:r>
-      <w:r>
-        <w:rPr>
-          <w:rFonts w:eastAsiaTheme="minorEastAsia"/>
-          <w:bCs/>
-          <w:sz w:val="24"/>
-          <w:szCs w:val="24"/>
-        </w:rPr>
-        <w:t xml:space="preserve"> are pushed onto the stack for each </w:t>
+        <w:t xml:space="preserve"> </w:t>
+      </w:r>
+      <w:r>
+        <w:rPr>
+          <w:rFonts w:eastAsiaTheme="minorEastAsia"/>
+          <w:bCs/>
+          <w:sz w:val="24"/>
+          <w:szCs w:val="24"/>
+        </w:rPr>
+        <w:t xml:space="preserve">are pushed onto the stack for each </w:t>
       </w:r>
       <m:oMath>
         <m:r>
@@ -8839,16 +8494,7 @@
           <w:sz w:val="24"/>
           <w:szCs w:val="24"/>
         </w:rPr>
-        <w:t>If the stack becomes empty</w:t>
-      </w:r>
-      <w:r>
-        <w:rPr>
-          <w:rFonts w:eastAsiaTheme="minorEastAsia"/>
-          <w:bCs/>
-          <w:sz w:val="24"/>
-          <w:szCs w:val="24"/>
-        </w:rPr>
-        <w:t xml:space="preserve"> except for the symbol pushed when the first </w:t>
+        <w:t xml:space="preserve">If the stack becomes empty exactly as the </w:t>
       </w:r>
       <m:oMath>
         <m:r>
@@ -8867,16 +8513,125 @@
           <w:sz w:val="24"/>
           <w:szCs w:val="24"/>
         </w:rPr>
-        <w:t xml:space="preserve"> is consumed</w:t>
-      </w:r>
-      <w:r>
-        <w:rPr>
-          <w:rFonts w:eastAsiaTheme="minorEastAsia"/>
-          <w:bCs/>
-          <w:sz w:val="24"/>
-          <w:szCs w:val="24"/>
-        </w:rPr>
-        <w:t xml:space="preserve"> exactly as the </w:t>
+        <w:t>s finish, the string is accepted.</w:t>
+      </w:r>
+    </w:p>
+    <w:p>
+      <w:pPr>
+        <w:ind w:left="990"/>
+        <w:rPr>
+          <w:rFonts w:eastAsiaTheme="minorEastAsia"/>
+          <w:bCs/>
+          <w:sz w:val="24"/>
+          <w:szCs w:val="24"/>
+        </w:rPr>
+      </w:pPr>
+      <w:r>
+        <w:rPr>
+          <w:rFonts w:eastAsiaTheme="minorEastAsia"/>
+          <w:bCs/>
+          <w:sz w:val="24"/>
+          <w:szCs w:val="24"/>
+        </w:rPr>
+        <w:t xml:space="preserve">The first behavior is implemented with transition functions for the initial state </w:t>
+      </w:r>
+      <m:oMath>
+        <m:sSub>
+          <m:sSubPr>
+            <m:ctrlPr>
+              <w:rPr>
+                <w:rFonts w:ascii="Cambria Math" w:eastAsiaTheme="minorEastAsia" w:hAnsi="Cambria Math"/>
+                <w:bCs/>
+                <w:i/>
+                <w:sz w:val="24"/>
+                <w:szCs w:val="24"/>
+              </w:rPr>
+            </m:ctrlPr>
+          </m:sSubPr>
+          <m:e>
+            <m:r>
+              <w:rPr>
+                <w:rFonts w:ascii="Cambria Math" w:eastAsiaTheme="minorEastAsia" w:hAnsi="Cambria Math"/>
+                <w:sz w:val="24"/>
+                <w:szCs w:val="24"/>
+              </w:rPr>
+              <m:t>q</m:t>
+            </m:r>
+          </m:e>
+          <m:sub>
+            <m:r>
+              <w:rPr>
+                <w:rFonts w:ascii="Cambria Math" w:eastAsiaTheme="minorEastAsia" w:hAnsi="Cambria Math"/>
+                <w:sz w:val="24"/>
+                <w:szCs w:val="24"/>
+              </w:rPr>
+              <m:t>0</m:t>
+            </m:r>
+          </m:sub>
+        </m:sSub>
+      </m:oMath>
+      <w:r>
+        <w:rPr>
+          <w:rFonts w:eastAsiaTheme="minorEastAsia"/>
+          <w:bCs/>
+          <w:sz w:val="24"/>
+          <w:szCs w:val="24"/>
+        </w:rPr>
+        <w:t xml:space="preserve">, while the second behavior is implemented with transition functions for some other state </w:t>
+      </w:r>
+      <m:oMath>
+        <m:sSub>
+          <m:sSubPr>
+            <m:ctrlPr>
+              <w:rPr>
+                <w:rFonts w:ascii="Cambria Math" w:eastAsiaTheme="minorEastAsia" w:hAnsi="Cambria Math"/>
+                <w:bCs/>
+                <w:i/>
+                <w:sz w:val="24"/>
+                <w:szCs w:val="24"/>
+              </w:rPr>
+            </m:ctrlPr>
+          </m:sSubPr>
+          <m:e>
+            <m:r>
+              <w:rPr>
+                <w:rFonts w:ascii="Cambria Math" w:eastAsiaTheme="minorEastAsia" w:hAnsi="Cambria Math"/>
+                <w:sz w:val="24"/>
+                <w:szCs w:val="24"/>
+              </w:rPr>
+              <m:t>q</m:t>
+            </m:r>
+          </m:e>
+          <m:sub>
+            <m:r>
+              <w:rPr>
+                <w:rFonts w:ascii="Cambria Math" w:eastAsiaTheme="minorEastAsia" w:hAnsi="Cambria Math"/>
+                <w:sz w:val="24"/>
+                <w:szCs w:val="24"/>
+              </w:rPr>
+              <m:t>1</m:t>
+            </m:r>
+          </m:sub>
+        </m:sSub>
+      </m:oMath>
+      <w:r>
+        <w:rPr>
+          <w:rFonts w:eastAsiaTheme="minorEastAsia"/>
+          <w:bCs/>
+          <w:sz w:val="24"/>
+          <w:szCs w:val="24"/>
+        </w:rPr>
+        <w:t xml:space="preserve">. </w:t>
+      </w:r>
+      <w:r>
+        <w:rPr>
+          <w:rFonts w:eastAsiaTheme="minorEastAsia"/>
+          <w:bCs/>
+          <w:sz w:val="24"/>
+          <w:szCs w:val="24"/>
+        </w:rPr>
+        <w:lastRenderedPageBreak/>
+        <w:t xml:space="preserve">When a </w:t>
       </w:r>
       <m:oMath>
         <m:r>
@@ -8895,7 +8650,157 @@
           <w:sz w:val="24"/>
           <w:szCs w:val="24"/>
         </w:rPr>
-        <w:t>s finish, the string is accepted.</w:t>
+        <w:t xml:space="preserve"> is encountered first, the transition function </w:t>
+      </w:r>
+      <m:oMath>
+        <m:r>
+          <w:rPr>
+            <w:rFonts w:ascii="Cambria Math" w:eastAsiaTheme="minorEastAsia" w:hAnsi="Cambria Math"/>
+            <w:sz w:val="24"/>
+            <w:szCs w:val="24"/>
+          </w:rPr>
+          <m:t>δ</m:t>
+        </m:r>
+        <m:d>
+          <m:dPr>
+            <m:ctrlPr>
+              <w:rPr>
+                <w:rFonts w:ascii="Cambria Math" w:eastAsiaTheme="minorEastAsia" w:hAnsi="Cambria Math"/>
+                <w:i/>
+                <w:sz w:val="24"/>
+                <w:szCs w:val="24"/>
+              </w:rPr>
+            </m:ctrlPr>
+          </m:dPr>
+          <m:e>
+            <m:sSub>
+              <m:sSubPr>
+                <m:ctrlPr>
+                  <w:rPr>
+                    <w:rFonts w:ascii="Cambria Math" w:eastAsiaTheme="minorEastAsia" w:hAnsi="Cambria Math"/>
+                    <w:i/>
+                    <w:sz w:val="24"/>
+                    <w:szCs w:val="24"/>
+                  </w:rPr>
+                </m:ctrlPr>
+              </m:sSubPr>
+              <m:e>
+                <m:r>
+                  <w:rPr>
+                    <w:rFonts w:ascii="Cambria Math" w:eastAsiaTheme="minorEastAsia" w:hAnsi="Cambria Math"/>
+                    <w:sz w:val="24"/>
+                    <w:szCs w:val="24"/>
+                  </w:rPr>
+                  <m:t>q</m:t>
+                </m:r>
+              </m:e>
+              <m:sub>
+                <m:r>
+                  <w:rPr>
+                    <w:rFonts w:ascii="Cambria Math" w:eastAsiaTheme="minorEastAsia" w:hAnsi="Cambria Math"/>
+                    <w:sz w:val="24"/>
+                    <w:szCs w:val="24"/>
+                  </w:rPr>
+                  <m:t>0</m:t>
+                </m:r>
+              </m:sub>
+            </m:sSub>
+            <m:r>
+              <w:rPr>
+                <w:rFonts w:ascii="Cambria Math" w:eastAsiaTheme="minorEastAsia" w:hAnsi="Cambria Math"/>
+                <w:sz w:val="24"/>
+                <w:szCs w:val="24"/>
+              </w:rPr>
+              <m:t>,b,Z</m:t>
+            </m:r>
+          </m:e>
+        </m:d>
+        <m:r>
+          <w:rPr>
+            <w:rFonts w:ascii="Cambria Math" w:eastAsiaTheme="minorEastAsia" w:hAnsi="Cambria Math"/>
+            <w:sz w:val="24"/>
+            <w:szCs w:val="24"/>
+          </w:rPr>
+          <m:t>=</m:t>
+        </m:r>
+        <m:d>
+          <m:dPr>
+            <m:begChr m:val="{"/>
+            <m:endChr m:val="}"/>
+            <m:ctrlPr>
+              <w:rPr>
+                <w:rFonts w:ascii="Cambria Math" w:eastAsiaTheme="minorEastAsia" w:hAnsi="Cambria Math"/>
+                <w:i/>
+                <w:sz w:val="24"/>
+                <w:szCs w:val="24"/>
+              </w:rPr>
+            </m:ctrlPr>
+          </m:dPr>
+          <m:e>
+            <m:d>
+              <m:dPr>
+                <m:ctrlPr>
+                  <w:rPr>
+                    <w:rFonts w:ascii="Cambria Math" w:eastAsiaTheme="minorEastAsia" w:hAnsi="Cambria Math"/>
+                    <w:i/>
+                    <w:sz w:val="24"/>
+                    <w:szCs w:val="24"/>
+                  </w:rPr>
+                </m:ctrlPr>
+              </m:dPr>
+              <m:e>
+                <m:sSub>
+                  <m:sSubPr>
+                    <m:ctrlPr>
+                      <w:rPr>
+                        <w:rFonts w:ascii="Cambria Math" w:eastAsiaTheme="minorEastAsia" w:hAnsi="Cambria Math"/>
+                        <w:i/>
+                        <w:sz w:val="24"/>
+                        <w:szCs w:val="24"/>
+                      </w:rPr>
+                    </m:ctrlPr>
+                  </m:sSubPr>
+                  <m:e>
+                    <m:r>
+                      <w:rPr>
+                        <w:rFonts w:ascii="Cambria Math" w:eastAsiaTheme="minorEastAsia" w:hAnsi="Cambria Math"/>
+                        <w:sz w:val="24"/>
+                        <w:szCs w:val="24"/>
+                      </w:rPr>
+                      <m:t>q</m:t>
+                    </m:r>
+                  </m:e>
+                  <m:sub>
+                    <m:r>
+                      <w:rPr>
+                        <w:rFonts w:ascii="Cambria Math" w:eastAsiaTheme="minorEastAsia" w:hAnsi="Cambria Math"/>
+                        <w:sz w:val="24"/>
+                        <w:szCs w:val="24"/>
+                      </w:rPr>
+                      <m:t>1</m:t>
+                    </m:r>
+                  </m:sub>
+                </m:sSub>
+                <m:r>
+                  <w:rPr>
+                    <w:rFonts w:ascii="Cambria Math" w:eastAsiaTheme="minorEastAsia" w:hAnsi="Cambria Math"/>
+                    <w:sz w:val="24"/>
+                    <w:szCs w:val="24"/>
+                  </w:rPr>
+                  <m:t>,Z</m:t>
+                </m:r>
+              </m:e>
+            </m:d>
+          </m:e>
+        </m:d>
+      </m:oMath>
+      <w:r>
+        <w:rPr>
+          <w:rFonts w:eastAsiaTheme="minorEastAsia"/>
+          <w:sz w:val="24"/>
+          <w:szCs w:val="24"/>
+        </w:rPr>
+        <w:t xml:space="preserve"> is used to change states, thereby implementing the second behavior.</w:t>
       </w:r>
     </w:p>
     <w:p>
@@ -12325,6 +12230,7 @@
               <w:sz w:val="24"/>
               <w:szCs w:val="24"/>
             </w:rPr>
+            <w:lastRenderedPageBreak/>
             <m:t>A→aAb|λ</m:t>
           </m:r>
           <m:r>
@@ -12355,7 +12261,6 @@
           <w:sz w:val="24"/>
           <w:szCs w:val="24"/>
         </w:rPr>
-        <w:lastRenderedPageBreak/>
         <w:t>Show</w:t>
       </w:r>
       <w:r>

</xml_diff>